<commit_message>
Fix v1-v3 report pairs to changed files only
</commit_message>
<xml_diff>
--- a/output/rlaif_before_after.docx
+++ b/output/rlaif_before_after.docx
@@ -47,7 +47,7 @@
           <w:b/>
           <w:sz w:val="30"/>
         </w:rPr>
-        <w:t>A. Core Engine Behavior</w:t>
+        <w:t>A. Trace History Narrative</w:t>
       </w:r>
     </w:p>
     <w:p>
@@ -58,7 +58,7 @@
         <w:t xml:space="preserve">The problem. </w:t>
       </w:r>
       <w:r>
-        <w:t>At baseline (trace-v), this section reflects earlier logic in rlaif_lab/engine.py before the current control refinements.</w:t>
+        <w:t>At baseline (trace-v), this section reflects earlier logic in TRACE_HISTORY.md before the current control refinements.</w:t>
       </w:r>
     </w:p>
     <w:p>
@@ -69,7 +69,7 @@
         <w:t xml:space="preserve">The change. </w:t>
       </w:r>
       <w:r>
-        <w:t>The latest commit (trace-v) applies 0 focused patch hunk(s), with +0 and -0 line changes in this file.</w:t>
+        <w:t>The latest commit (trace-v) applies 1 focused patch hunk(s), with +42 and -0 line changes in this file.</w:t>
       </w:r>
     </w:p>
     <w:p>
@@ -80,7 +80,7 @@
         <w:t xml:space="preserve">The effect. </w:t>
       </w:r>
       <w:r>
-        <w:t>Comparison now has commit-pinned before/after evidence and a structured delta table with 3 key setting/value changes.</w:t>
+        <w:t>Comparison now has commit-pinned before/after evidence and a structured delta table with 2 key setting/value changes.</w:t>
       </w:r>
     </w:p>
     <w:p>
@@ -156,7 +156,7 @@
           </w:tcPr>
           <w:p>
             <w:r>
-              <w:t>file_path</w:t>
+              <w:t>taxonomy</w:t>
             </w:r>
           </w:p>
         </w:tc>
@@ -166,7 +166,7 @@
           </w:tcPr>
           <w:p>
             <w:r>
-              <w:t>rlaif_lab/engine.py</w:t>
+              <w:t>(empty)</w:t>
             </w:r>
           </w:p>
         </w:tc>
@@ -176,7 +176,7 @@
           </w:tcPr>
           <w:p>
             <w:r>
-              <w:t>rlaif_lab/engine.py</w:t>
+              <w:t>sharpen agent descriptions for routing</w:t>
             </w:r>
           </w:p>
         </w:tc>
@@ -188,7 +188,7 @@
           </w:tcPr>
           <w:p>
             <w:r>
-              <w:t>commit_ref</w:t>
+              <w:t>sequencing</w:t>
             </w:r>
           </w:p>
         </w:tc>
@@ -198,7 +198,7 @@
           </w:tcPr>
           <w:p>
             <w:r>
-              <w:t>trace-v</w:t>
+              <w:t>(empty)</w:t>
             </w:r>
           </w:p>
         </w:tc>
@@ -208,39 +208,7 @@
           </w:tcPr>
           <w:p>
             <w:r>
-              <w:t>trace-v</w:t>
-            </w:r>
-          </w:p>
-        </w:tc>
-      </w:tr>
-      <w:tr>
-        <w:tc>
-          <w:tcPr>
-            <w:tcW w:type="dxa" w:w="4800"/>
-          </w:tcPr>
-          <w:p>
-            <w:r>
-              <w:t>line_delta</w:t>
-            </w:r>
-          </w:p>
-        </w:tc>
-        <w:tc>
-          <w:tcPr>
-            <w:tcW w:type="dxa" w:w="4800"/>
-          </w:tcPr>
-          <w:p>
-            <w:r>
-              <w:t>+0</w:t>
-            </w:r>
-          </w:p>
-        </w:tc>
-        <w:tc>
-          <w:tcPr>
-            <w:tcW w:type="dxa" w:w="4800"/>
-          </w:tcPr>
-          <w:p>
-            <w:r>
-              <w:t>-0</w:t>
+              <w:t>phase-gate tool selection</w:t>
             </w:r>
           </w:p>
         </w:tc>
@@ -291,7 +259,7 @@
               <w:r>
                 <w:drawing>
                   <wp:inline xmlns:a="http://schemas.openxmlformats.org/drawingml/2006/main" xmlns:pic="http://schemas.openxmlformats.org/drawingml/2006/picture">
-                    <wp:extent cx="4480560" cy="5477382"/>
+                    <wp:extent cx="4480560" cy="596038"/>
                     <wp:docPr id="1" name="Picture 1"/>
                     <wp:cNvGraphicFramePr>
                       <a:graphicFrameLocks noChangeAspect="1"/>
@@ -312,7 +280,7 @@
                           <pic:spPr>
                             <a:xfrm>
                               <a:off x="0" y="0"/>
-                              <a:ext cx="4480560" cy="5477382"/>
+                              <a:ext cx="4480560" cy="596038"/>
                             </a:xfrm>
                             <a:prstGeom prst="rect"/>
                           </pic:spPr>
@@ -332,7 +300,7 @@
               <w:rPr>
                 <w:sz w:val="20"/>
               </w:rPr>
-              <w:t>Baseline behavior from trace-v1.</w:t>
+              <w:t>Baseline trace-history narrative at v1.</w:t>
             </w:r>
           </w:p>
           <w:p>
@@ -346,7 +314,7 @@
                 <w:sz w:val="22"/>
                 <w:shd w:fill="FFF200"/>
               </w:rPr>
-              <w:t>Engine delta</w:t>
+              <w:t>Narrative and governance delta</w:t>
             </w:r>
           </w:p>
           <w:p>
@@ -397,7 +365,7 @@
               <w:r>
                 <w:drawing>
                   <wp:inline xmlns:a="http://schemas.openxmlformats.org/drawingml/2006/main" xmlns:pic="http://schemas.openxmlformats.org/drawingml/2006/picture">
-                    <wp:extent cx="4480560" cy="5477382"/>
+                    <wp:extent cx="4480560" cy="2404704"/>
                     <wp:docPr id="2" name="Picture 2"/>
                     <wp:cNvGraphicFramePr>
                       <a:graphicFrameLocks noChangeAspect="1"/>
@@ -418,7 +386,7 @@
                           <pic:spPr>
                             <a:xfrm>
                               <a:off x="0" y="0"/>
-                              <a:ext cx="4480560" cy="5477382"/>
+                              <a:ext cx="4480560" cy="2404704"/>
                             </a:xfrm>
                             <a:prstGeom prst="rect"/>
                           </pic:spPr>
@@ -438,7 +406,7 @@
               <w:rPr>
                 <w:sz w:val="20"/>
               </w:rPr>
-              <w:t>Updated behavior from trace-v3.</w:t>
+              <w:t>Updated trace-history narrative at v3.</w:t>
             </w:r>
           </w:p>
           <w:p>
@@ -452,7 +420,7 @@
                 <w:sz w:val="22"/>
                 <w:shd w:fill="FFF200"/>
               </w:rPr>
-              <w:t>Engine delta</w:t>
+              <w:t>Narrative and governance delta</w:t>
             </w:r>
           </w:p>
           <w:p>
@@ -487,7 +455,7 @@
           <w:b/>
           <w:sz w:val="30"/>
         </w:rPr>
-        <w:t>B. Reward and Learning Loop</w:t>
+        <w:t>B. Cycle Summary Output</w:t>
       </w:r>
     </w:p>
     <w:p>
@@ -498,7 +466,7 @@
         <w:t xml:space="preserve">The problem. </w:t>
       </w:r>
       <w:r>
-        <w:t>At baseline (trace-v), this section reflects earlier logic in rlaif_lab/rl.py before the current control refinements.</w:t>
+        <w:t>At baseline (trace-v), this section reflects earlier logic in artifacts/cycle_summary.json before the current control refinements.</w:t>
       </w:r>
     </w:p>
     <w:p>
@@ -509,7 +477,7 @@
         <w:t xml:space="preserve">The change. </w:t>
       </w:r>
       <w:r>
-        <w:t>The latest commit (trace-v) applies 0 focused patch hunk(s), with +0 and -0 line changes in this file.</w:t>
+        <w:t>The latest commit (trace-v) applies 21 focused patch hunk(s), with +42 and -45 line changes in this file.</w:t>
       </w:r>
     </w:p>
     <w:p>
@@ -520,7 +488,7 @@
         <w:t xml:space="preserve">The effect. </w:t>
       </w:r>
       <w:r>
-        <w:t>Comparison now has commit-pinned before/after evidence and a structured delta table with 3 key setting/value changes.</w:t>
+        <w:t>Comparison now has commit-pinned before/after evidence and a structured delta table with 8 key setting/value changes.</w:t>
       </w:r>
     </w:p>
     <w:p>
@@ -596,7 +564,7 @@
           </w:tcPr>
           <w:p>
             <w:r>
-              <w:t>file_path</w:t>
+              <w:t>deployed_levers</w:t>
             </w:r>
           </w:p>
         </w:tc>
@@ -606,7 +574,7 @@
           </w:tcPr>
           <w:p>
             <w:r>
-              <w:t>rlaif_lab/rl.py</w:t>
+              <w:t>[]</w:t>
             </w:r>
           </w:p>
         </w:tc>
@@ -616,7 +584,7 @@
           </w:tcPr>
           <w:p>
             <w:r>
-              <w:t>rlaif_lab/rl.py</w:t>
+              <w:t>[</w:t>
             </w:r>
           </w:p>
         </w:tc>
@@ -628,7 +596,7 @@
           </w:tcPr>
           <w:p>
             <w:r>
-              <w:t>commit_ref</w:t>
+              <w:t>avg_compliance_rate</w:t>
             </w:r>
           </w:p>
         </w:tc>
@@ -638,7 +606,7 @@
           </w:tcPr>
           <w:p>
             <w:r>
-              <w:t>trace-v</w:t>
+              <w:t>0.381</w:t>
             </w:r>
           </w:p>
         </w:tc>
@@ -648,7 +616,7 @@
           </w:tcPr>
           <w:p>
             <w:r>
-              <w:t>trace-v</w:t>
+              <w:t>0.577</w:t>
             </w:r>
           </w:p>
         </w:tc>
@@ -660,7 +628,7 @@
           </w:tcPr>
           <w:p>
             <w:r>
-              <w:t>line_delta</w:t>
+              <w:t>action_completion_rate</w:t>
             </w:r>
           </w:p>
         </w:tc>
@@ -670,7 +638,7 @@
           </w:tcPr>
           <w:p>
             <w:r>
-              <w:t>+0</w:t>
+              <w:t>0.45</w:t>
             </w:r>
           </w:p>
         </w:tc>
@@ -680,7 +648,167 @@
           </w:tcPr>
           <w:p>
             <w:r>
-              <w:t>-0</w:t>
+              <w:t>1.0</w:t>
+            </w:r>
+          </w:p>
+        </w:tc>
+      </w:tr>
+      <w:tr>
+        <w:tc>
+          <w:tcPr>
+            <w:tcW w:type="dxa" w:w="4800"/>
+          </w:tcPr>
+          <w:p>
+            <w:r>
+              <w:t>REPETITIVE_LOOP</w:t>
+            </w:r>
+          </w:p>
+        </w:tc>
+        <w:tc>
+          <w:tcPr>
+            <w:tcW w:type="dxa" w:w="4800"/>
+          </w:tcPr>
+          <w:p>
+            <w:r>
+              <w:t>33</w:t>
+            </w:r>
+          </w:p>
+        </w:tc>
+        <w:tc>
+          <w:tcPr>
+            <w:tcW w:type="dxa" w:w="4800"/>
+          </w:tcPr>
+          <w:p>
+            <w:r>
+              <w:t>(empty)</w:t>
+            </w:r>
+          </w:p>
+        </w:tc>
+      </w:tr>
+      <w:tr>
+        <w:tc>
+          <w:tcPr>
+            <w:tcW w:type="dxa" w:w="4800"/>
+          </w:tcPr>
+          <w:p>
+            <w:r>
+              <w:t>LIVE_AGENT_HANDOFF</w:t>
+            </w:r>
+          </w:p>
+        </w:tc>
+        <w:tc>
+          <w:tcPr>
+            <w:tcW w:type="dxa" w:w="4800"/>
+          </w:tcPr>
+          <w:p>
+            <w:r>
+              <w:t>23</w:t>
+            </w:r>
+          </w:p>
+        </w:tc>
+        <w:tc>
+          <w:tcPr>
+            <w:tcW w:type="dxa" w:w="4800"/>
+          </w:tcPr>
+          <w:p>
+            <w:r>
+              <w:t>30</w:t>
+            </w:r>
+          </w:p>
+        </w:tc>
+      </w:tr>
+      <w:tr>
+        <w:tc>
+          <w:tcPr>
+            <w:tcW w:type="dxa" w:w="4800"/>
+          </w:tcPr>
+          <w:p>
+            <w:r>
+              <w:t>RESOLVED</w:t>
+            </w:r>
+          </w:p>
+        </w:tc>
+        <w:tc>
+          <w:tcPr>
+            <w:tcW w:type="dxa" w:w="4800"/>
+          </w:tcPr>
+          <w:p>
+            <w:r>
+              <w:t>4</w:t>
+            </w:r>
+          </w:p>
+        </w:tc>
+        <w:tc>
+          <w:tcPr>
+            <w:tcW w:type="dxa" w:w="4800"/>
+          </w:tcPr>
+          <w:p>
+            <w:r>
+              <w:t>30</w:t>
+            </w:r>
+          </w:p>
+        </w:tc>
+      </w:tr>
+      <w:tr>
+        <w:tc>
+          <w:tcPr>
+            <w:tcW w:type="dxa" w:w="4800"/>
+          </w:tcPr>
+          <w:p>
+            <w:r>
+              <w:t>GEN-02</w:t>
+            </w:r>
+          </w:p>
+        </w:tc>
+        <w:tc>
+          <w:tcPr>
+            <w:tcW w:type="dxa" w:w="4800"/>
+          </w:tcPr>
+          <w:p>
+            <w:r>
+              <w:t>"33 -&gt; 33 fails"</w:t>
+            </w:r>
+          </w:p>
+        </w:tc>
+        <w:tc>
+          <w:tcPr>
+            <w:tcW w:type="dxa" w:w="4800"/>
+          </w:tcPr>
+          <w:p>
+            <w:r>
+              <w:t>"33 -&gt; 30 fails"</w:t>
+            </w:r>
+          </w:p>
+        </w:tc>
+      </w:tr>
+      <w:tr>
+        <w:tc>
+          <w:tcPr>
+            <w:tcW w:type="dxa" w:w="4800"/>
+          </w:tcPr>
+          <w:p>
+            <w:r>
+              <w:t>GEN-04</w:t>
+            </w:r>
+          </w:p>
+        </w:tc>
+        <w:tc>
+          <w:tcPr>
+            <w:tcW w:type="dxa" w:w="4800"/>
+          </w:tcPr>
+          <w:p>
+            <w:r>
+              <w:t>"11 -&gt; 11 fails"</w:t>
+            </w:r>
+          </w:p>
+        </w:tc>
+        <w:tc>
+          <w:tcPr>
+            <w:tcW w:type="dxa" w:w="4800"/>
+          </w:tcPr>
+          <w:p>
+            <w:r>
+              <w:t>"11 -&gt; 0 fails"</w:t>
             </w:r>
           </w:p>
         </w:tc>
@@ -731,7 +859,7 @@
               <w:r>
                 <w:drawing>
                   <wp:inline xmlns:a="http://schemas.openxmlformats.org/drawingml/2006/main" xmlns:pic="http://schemas.openxmlformats.org/drawingml/2006/picture">
-                    <wp:extent cx="4480560" cy="5425999"/>
+                    <wp:extent cx="4480560" cy="1130417"/>
                     <wp:docPr id="3" name="Picture 3"/>
                     <wp:cNvGraphicFramePr>
                       <a:graphicFrameLocks noChangeAspect="1"/>
@@ -752,7 +880,7 @@
                           <pic:spPr>
                             <a:xfrm>
                               <a:off x="0" y="0"/>
-                              <a:ext cx="4480560" cy="5425999"/>
+                              <a:ext cx="4480560" cy="1130417"/>
                             </a:xfrm>
                             <a:prstGeom prst="rect"/>
                           </pic:spPr>
@@ -772,7 +900,7 @@
               <w:rPr>
                 <w:sz w:val="20"/>
               </w:rPr>
-              <w:t>Baseline behavior from trace-v1.</w:t>
+              <w:t>Baseline cycle summary output at v1.</w:t>
             </w:r>
           </w:p>
           <w:p>
@@ -786,7 +914,7 @@
                 <w:sz w:val="22"/>
                 <w:shd w:fill="FFF200"/>
               </w:rPr>
-              <w:t>RL delta</w:t>
+              <w:t>Cycle summary delta</w:t>
             </w:r>
           </w:p>
           <w:p>
@@ -837,7 +965,7 @@
               <w:r>
                 <w:drawing>
                   <wp:inline xmlns:a="http://schemas.openxmlformats.org/drawingml/2006/main" xmlns:pic="http://schemas.openxmlformats.org/drawingml/2006/picture">
-                    <wp:extent cx="4480560" cy="5425999"/>
+                    <wp:extent cx="4480560" cy="1130417"/>
                     <wp:docPr id="4" name="Picture 4"/>
                     <wp:cNvGraphicFramePr>
                       <a:graphicFrameLocks noChangeAspect="1"/>
@@ -858,7 +986,7 @@
                           <pic:spPr>
                             <a:xfrm>
                               <a:off x="0" y="0"/>
-                              <a:ext cx="4480560" cy="5425999"/>
+                              <a:ext cx="4480560" cy="1130417"/>
                             </a:xfrm>
                             <a:prstGeom prst="rect"/>
                           </pic:spPr>
@@ -878,7 +1006,7 @@
               <w:rPr>
                 <w:sz w:val="20"/>
               </w:rPr>
-              <w:t>Updated behavior from trace-v3.</w:t>
+              <w:t>Updated cycle summary output at v3.</w:t>
             </w:r>
           </w:p>
           <w:p>
@@ -892,7 +1020,7 @@
                 <w:sz w:val="22"/>
                 <w:shd w:fill="FFF200"/>
               </w:rPr>
-              <w:t>RL delta</w:t>
+              <w:t>Cycle summary delta</w:t>
             </w:r>
           </w:p>
           <w:p>
@@ -927,7 +1055,7 @@
           <w:b/>
           <w:sz w:val="30"/>
         </w:rPr>
-        <w:t>C. Judge and Evaluation Logic</w:t>
+        <w:t>C. Preference Pairs Dataset</w:t>
       </w:r>
     </w:p>
     <w:p>
@@ -938,7 +1066,7 @@
         <w:t xml:space="preserve">The problem. </w:t>
       </w:r>
       <w:r>
-        <w:t>At baseline (trace-v), this section reflects earlier logic in rlaif_lab/judge.py before the current control refinements.</w:t>
+        <w:t>At baseline (trace-v), this section reflects earlier logic in artifacts/preference_pairs.json before the current control refinements.</w:t>
       </w:r>
     </w:p>
     <w:p>
@@ -949,7 +1077,7 @@
         <w:t xml:space="preserve">The change. </w:t>
       </w:r>
       <w:r>
-        <w:t>The latest commit (trace-v) applies 0 focused patch hunk(s), with +0 and -0 line changes in this file.</w:t>
+        <w:t>The latest commit (trace-v) applies 1 focused patch hunk(s), with +1759 and -1 line changes in this file.</w:t>
       </w:r>
     </w:p>
     <w:p>
@@ -960,7 +1088,7 @@
         <w:t xml:space="preserve">The effect. </w:t>
       </w:r>
       <w:r>
-        <w:t>Comparison now has commit-pinned before/after evidence and a structured delta table with 3 key setting/value changes.</w:t>
+        <w:t>Comparison now has commit-pinned before/after evidence and a structured delta table with 8 key setting/value changes.</w:t>
       </w:r>
     </w:p>
     <w:p>
@@ -1036,7 +1164,7 @@
           </w:tcPr>
           <w:p>
             <w:r>
-              <w:t>file_path</w:t>
+              <w:t>pair_id</w:t>
             </w:r>
           </w:p>
         </w:tc>
@@ -1046,7 +1174,7 @@
           </w:tcPr>
           <w:p>
             <w:r>
-              <w:t>rlaif_lab/judge.py</w:t>
+              <w:t>(empty)</w:t>
             </w:r>
           </w:p>
         </w:tc>
@@ -1056,7 +1184,7 @@
           </w:tcPr>
           <w:p>
             <w:r>
-              <w:t>rlaif_lab/judge.py</w:t>
+              <w:t>"pp-ep-0059"</w:t>
             </w:r>
           </w:p>
         </w:tc>
@@ -1068,7 +1196,7 @@
           </w:tcPr>
           <w:p>
             <w:r>
-              <w:t>commit_ref</w:t>
+              <w:t>episode</w:t>
             </w:r>
           </w:p>
         </w:tc>
@@ -1078,7 +1206,7 @@
           </w:tcPr>
           <w:p>
             <w:r>
-              <w:t>trace-v</w:t>
+              <w:t>(empty)</w:t>
             </w:r>
           </w:p>
         </w:tc>
@@ -1088,7 +1216,7 @@
           </w:tcPr>
           <w:p>
             <w:r>
-              <w:t>trace-v</w:t>
+              <w:t>"ep-0059"</w:t>
             </w:r>
           </w:p>
         </w:tc>
@@ -1100,7 +1228,7 @@
           </w:tcPr>
           <w:p>
             <w:r>
-              <w:t>line_delta</w:t>
+              <w:t>journey</w:t>
             </w:r>
           </w:p>
         </w:tc>
@@ -1110,7 +1238,7 @@
           </w:tcPr>
           <w:p>
             <w:r>
-              <w:t>+0</w:t>
+              <w:t>(empty)</w:t>
             </w:r>
           </w:p>
         </w:tc>
@@ -1120,7 +1248,167 @@
           </w:tcPr>
           <w:p>
             <w:r>
-              <w:t>-0</w:t>
+              <w:t>"gen"</w:t>
+            </w:r>
+          </w:p>
+        </w:tc>
+      </w:tr>
+      <w:tr>
+        <w:tc>
+          <w:tcPr>
+            <w:tcW w:type="dxa" w:w="4800"/>
+          </w:tcPr>
+          <w:p>
+            <w:r>
+              <w:t>utterance</w:t>
+            </w:r>
+          </w:p>
+        </w:tc>
+        <w:tc>
+          <w:tcPr>
+            <w:tcW w:type="dxa" w:w="4800"/>
+          </w:tcPr>
+          <w:p>
+            <w:r>
+              <w:t>(empty)</w:t>
+            </w:r>
+          </w:p>
+        </w:tc>
+        <w:tc>
+          <w:tcPr>
+            <w:tcW w:type="dxa" w:w="4800"/>
+          </w:tcPr>
+          <w:p>
+            <w:r>
+              <w:t>"I want to talk to a person. Also what is this $9.99 charge, and I need a new phone."</w:t>
+            </w:r>
+          </w:p>
+        </w:tc>
+      </w:tr>
+      <w:tr>
+        <w:tc>
+          <w:tcPr>
+            <w:tcW w:type="dxa" w:w="4800"/>
+          </w:tcPr>
+          <w:p>
+            <w:r>
+              <w:t>rejected</w:t>
+            </w:r>
+          </w:p>
+        </w:tc>
+        <w:tc>
+          <w:tcPr>
+            <w:tcW w:type="dxa" w:w="4800"/>
+          </w:tcPr>
+          <w:p>
+            <w:r>
+              <w:t>(empty)</w:t>
+            </w:r>
+          </w:p>
+        </w:tc>
+        <w:tc>
+          <w:tcPr>
+            <w:tcW w:type="dxa" w:w="4800"/>
+          </w:tcPr>
+          <w:p>
+            <w:r>
+              <w:t>{</w:t>
+            </w:r>
+          </w:p>
+        </w:tc>
+      </w:tr>
+      <w:tr>
+        <w:tc>
+          <w:tcPr>
+            <w:tcW w:type="dxa" w:w="4800"/>
+          </w:tcPr>
+          <w:p>
+            <w:r>
+              <w:t>levers</w:t>
+            </w:r>
+          </w:p>
+        </w:tc>
+        <w:tc>
+          <w:tcPr>
+            <w:tcW w:type="dxa" w:w="4800"/>
+          </w:tcPr>
+          <w:p>
+            <w:r>
+              <w:t>(empty)</w:t>
+            </w:r>
+          </w:p>
+        </w:tc>
+        <w:tc>
+          <w:tcPr>
+            <w:tcW w:type="dxa" w:w="4800"/>
+          </w:tcPr>
+          <w:p>
+            <w:r>
+              <w:t>[</w:t>
+            </w:r>
+          </w:p>
+        </w:tc>
+      </w:tr>
+      <w:tr>
+        <w:tc>
+          <w:tcPr>
+            <w:tcW w:type="dxa" w:w="4800"/>
+          </w:tcPr>
+          <w:p>
+            <w:r>
+              <w:t>weighted</w:t>
+            </w:r>
+          </w:p>
+        </w:tc>
+        <w:tc>
+          <w:tcPr>
+            <w:tcW w:type="dxa" w:w="4800"/>
+          </w:tcPr>
+          <w:p>
+            <w:r>
+              <w:t>(empty)</w:t>
+            </w:r>
+          </w:p>
+        </w:tc>
+        <w:tc>
+          <w:tcPr>
+            <w:tcW w:type="dxa" w:w="4800"/>
+          </w:tcPr>
+          <w:p>
+            <w:r>
+              <w:t>2.35</w:t>
+            </w:r>
+          </w:p>
+        </w:tc>
+      </w:tr>
+      <w:tr>
+        <w:tc>
+          <w:tcPr>
+            <w:tcW w:type="dxa" w:w="4800"/>
+          </w:tcPr>
+          <w:p>
+            <w:r>
+              <w:t>verdict</w:t>
+            </w:r>
+          </w:p>
+        </w:tc>
+        <w:tc>
+          <w:tcPr>
+            <w:tcW w:type="dxa" w:w="4800"/>
+          </w:tcPr>
+          <w:p>
+            <w:r>
+              <w:t>(empty)</w:t>
+            </w:r>
+          </w:p>
+        </w:tc>
+        <w:tc>
+          <w:tcPr>
+            <w:tcW w:type="dxa" w:w="4800"/>
+          </w:tcPr>
+          <w:p>
+            <w:r>
+              <w:t>"Rejected"</w:t>
             </w:r>
           </w:p>
         </w:tc>
@@ -1171,7 +1459,7 @@
               <w:r>
                 <w:drawing>
                   <wp:inline xmlns:a="http://schemas.openxmlformats.org/drawingml/2006/main" xmlns:pic="http://schemas.openxmlformats.org/drawingml/2006/picture">
-                    <wp:extent cx="4480560" cy="5425999"/>
+                    <wp:extent cx="4480560" cy="149009"/>
                     <wp:docPr id="5" name="Picture 5"/>
                     <wp:cNvGraphicFramePr>
                       <a:graphicFrameLocks noChangeAspect="1"/>
@@ -1192,7 +1480,7 @@
                           <pic:spPr>
                             <a:xfrm>
                               <a:off x="0" y="0"/>
-                              <a:ext cx="4480560" cy="5425999"/>
+                              <a:ext cx="4480560" cy="149009"/>
                             </a:xfrm>
                             <a:prstGeom prst="rect"/>
                           </pic:spPr>
@@ -1212,7 +1500,7 @@
               <w:rPr>
                 <w:sz w:val="20"/>
               </w:rPr>
-              <w:t>Baseline behavior from trace-v1.</w:t>
+              <w:t>Baseline preference-pair records at v1.</w:t>
             </w:r>
           </w:p>
           <w:p>
@@ -1226,7 +1514,7 @@
                 <w:sz w:val="22"/>
                 <w:shd w:fill="FFF200"/>
               </w:rPr>
-              <w:t>Judge delta</w:t>
+              <w:t>Preference data delta</w:t>
             </w:r>
           </w:p>
           <w:p>
@@ -1277,7 +1565,7 @@
               <w:r>
                 <w:drawing>
                   <wp:inline xmlns:a="http://schemas.openxmlformats.org/drawingml/2006/main" xmlns:pic="http://schemas.openxmlformats.org/drawingml/2006/picture">
-                    <wp:extent cx="4480560" cy="5425999"/>
+                    <wp:extent cx="4480560" cy="5554456"/>
                     <wp:docPr id="6" name="Picture 6"/>
                     <wp:cNvGraphicFramePr>
                       <a:graphicFrameLocks noChangeAspect="1"/>
@@ -1298,7 +1586,7 @@
                           <pic:spPr>
                             <a:xfrm>
                               <a:off x="0" y="0"/>
-                              <a:ext cx="4480560" cy="5425999"/>
+                              <a:ext cx="4480560" cy="5554456"/>
                             </a:xfrm>
                             <a:prstGeom prst="rect"/>
                           </pic:spPr>
@@ -1318,7 +1606,7 @@
               <w:rPr>
                 <w:sz w:val="20"/>
               </w:rPr>
-              <w:t>Updated behavior from trace-v3.</w:t>
+              <w:t>Updated preference-pair records at v3.</w:t>
             </w:r>
           </w:p>
           <w:p>
@@ -1332,7 +1620,7 @@
                 <w:sz w:val="22"/>
                 <w:shd w:fill="FFF200"/>
               </w:rPr>
-              <w:t>Judge delta</w:t>
+              <w:t>Preference data delta</w:t>
             </w:r>
           </w:p>
           <w:p>
@@ -1367,7 +1655,7 @@
           <w:b/>
           <w:sz w:val="30"/>
         </w:rPr>
-        <w:t>D. Policy and Rule Controls</w:t>
+        <w:t>D. Recommendation Output</w:t>
       </w:r>
     </w:p>
     <w:p>
@@ -1378,7 +1666,7 @@
         <w:t xml:space="preserve">The problem. </w:t>
       </w:r>
       <w:r>
-        <w:t>At baseline (trace-v), this section reflects earlier logic in rlaif_lab/policies.py before the current control refinements.</w:t>
+        <w:t>At baseline (trace-v), this section reflects earlier logic in artifacts/recommendations.json before the current control refinements.</w:t>
       </w:r>
     </w:p>
     <w:p>
@@ -1389,7 +1677,7 @@
         <w:t xml:space="preserve">The change. </w:t>
       </w:r>
       <w:r>
-        <w:t>The latest commit (trace-v) applies 0 focused patch hunk(s), with +0 and -0 line changes in this file.</w:t>
+        <w:t>The latest commit (trace-v) applies 11 focused patch hunk(s), with +19 and -19 line changes in this file.</w:t>
       </w:r>
     </w:p>
     <w:p>
@@ -1400,7 +1688,7 @@
         <w:t xml:space="preserve">The effect. </w:t>
       </w:r>
       <w:r>
-        <w:t>Comparison now has commit-pinned before/after evidence and a structured delta table with 3 key setting/value changes.</w:t>
+        <w:t>Comparison now has commit-pinned before/after evidence and a structured delta table with 8 key setting/value changes.</w:t>
       </w:r>
     </w:p>
     <w:p>
@@ -1476,7 +1764,7 @@
           </w:tcPr>
           <w:p>
             <w:r>
-              <w:t>file_path</w:t>
+              <w:t>route_accuracy</w:t>
             </w:r>
           </w:p>
         </w:tc>
@@ -1486,7 +1774,7 @@
           </w:tcPr>
           <w:p>
             <w:r>
-              <w:t>rlaif_lab/policies.py</w:t>
+              <w:t>"0.267 -&gt; 0.267"</w:t>
             </w:r>
           </w:p>
         </w:tc>
@@ -1496,7 +1784,7 @@
           </w:tcPr>
           <w:p>
             <w:r>
-              <w:t>rlaif_lab/policies.py</w:t>
+              <w:t>"0.267 -&gt; 1.0"</w:t>
             </w:r>
           </w:p>
         </w:tc>
@@ -1508,7 +1796,7 @@
           </w:tcPr>
           <w:p>
             <w:r>
-              <w:t>commit_ref</w:t>
+              <w:t>GEN-09</w:t>
             </w:r>
           </w:p>
         </w:tc>
@@ -1518,7 +1806,7 @@
           </w:tcPr>
           <w:p>
             <w:r>
-              <w:t>trace-v</w:t>
+              <w:t>"41 -&gt; 41 fails"</w:t>
             </w:r>
           </w:p>
         </w:tc>
@@ -1528,7 +1816,7 @@
           </w:tcPr>
           <w:p>
             <w:r>
-              <w:t>trace-v</w:t>
+              <w:t>"41 -&gt; 15 fails"</w:t>
             </w:r>
           </w:p>
         </w:tc>
@@ -1540,7 +1828,7 @@
           </w:tcPr>
           <w:p>
             <w:r>
-              <w:t>line_delta</w:t>
+              <w:t>DDC-01</w:t>
             </w:r>
           </w:p>
         </w:tc>
@@ -1550,7 +1838,7 @@
           </w:tcPr>
           <w:p>
             <w:r>
-              <w:t>+0</w:t>
+              <w:t>"11 -&gt; 11 fails"</w:t>
             </w:r>
           </w:p>
         </w:tc>
@@ -1560,7 +1848,167 @@
           </w:tcPr>
           <w:p>
             <w:r>
-              <w:t>-0</w:t>
+              <w:t>"11 -&gt; 0 fails"</w:t>
+            </w:r>
+          </w:p>
+        </w:tc>
+      </w:tr>
+      <w:tr>
+        <w:tc>
+          <w:tcPr>
+            <w:tcW w:type="dxa" w:w="4800"/>
+          </w:tcPr>
+          <w:p>
+            <w:r>
+              <w:t>leaks_full</w:t>
+            </w:r>
+          </w:p>
+        </w:tc>
+        <w:tc>
+          <w:tcPr>
+            <w:tcW w:type="dxa" w:w="4800"/>
+          </w:tcPr>
+          <w:p>
+            <w:r>
+              <w:t>198</w:t>
+            </w:r>
+          </w:p>
+        </w:tc>
+        <w:tc>
+          <w:tcPr>
+            <w:tcW w:type="dxa" w:w="4800"/>
+          </w:tcPr>
+          <w:p>
+            <w:r>
+              <w:t>165</w:t>
+            </w:r>
+          </w:p>
+        </w:tc>
+      </w:tr>
+      <w:tr>
+        <w:tc>
+          <w:tcPr>
+            <w:tcW w:type="dxa" w:w="4800"/>
+          </w:tcPr>
+          <w:p>
+            <w:r>
+              <w:t>GEN-02</w:t>
+            </w:r>
+          </w:p>
+        </w:tc>
+        <w:tc>
+          <w:tcPr>
+            <w:tcW w:type="dxa" w:w="4800"/>
+          </w:tcPr>
+          <w:p>
+            <w:r>
+              <w:t>"33 -&gt; 33 fails"</w:t>
+            </w:r>
+          </w:p>
+        </w:tc>
+        <w:tc>
+          <w:tcPr>
+            <w:tcW w:type="dxa" w:w="4800"/>
+          </w:tcPr>
+          <w:p>
+            <w:r>
+              <w:t>"33 -&gt; 30 fails"</w:t>
+            </w:r>
+          </w:p>
+        </w:tc>
+      </w:tr>
+      <w:tr>
+        <w:tc>
+          <w:tcPr>
+            <w:tcW w:type="dxa" w:w="4800"/>
+          </w:tcPr>
+          <w:p>
+            <w:r>
+              <w:t>GEN-08</w:t>
+            </w:r>
+          </w:p>
+        </w:tc>
+        <w:tc>
+          <w:tcPr>
+            <w:tcW w:type="dxa" w:w="4800"/>
+          </w:tcPr>
+          <w:p>
+            <w:r>
+              <w:t>"33 -&gt; 33 fails"</w:t>
+            </w:r>
+          </w:p>
+        </w:tc>
+        <w:tc>
+          <w:tcPr>
+            <w:tcW w:type="dxa" w:w="4800"/>
+          </w:tcPr>
+          <w:p>
+            <w:r>
+              <w:t>"33 -&gt; 30 fails"</w:t>
+            </w:r>
+          </w:p>
+        </w:tc>
+      </w:tr>
+      <w:tr>
+        <w:tc>
+          <w:tcPr>
+            <w:tcW w:type="dxa" w:w="4800"/>
+          </w:tcPr>
+          <w:p>
+            <w:r>
+              <w:t>GEN-04</w:t>
+            </w:r>
+          </w:p>
+        </w:tc>
+        <w:tc>
+          <w:tcPr>
+            <w:tcW w:type="dxa" w:w="4800"/>
+          </w:tcPr>
+          <w:p>
+            <w:r>
+              <w:t>"11 -&gt; 11 fails"</w:t>
+            </w:r>
+          </w:p>
+        </w:tc>
+        <w:tc>
+          <w:tcPr>
+            <w:tcW w:type="dxa" w:w="4800"/>
+          </w:tcPr>
+          <w:p>
+            <w:r>
+              <w:t>"11 -&gt; 0 fails"</w:t>
+            </w:r>
+          </w:p>
+        </w:tc>
+      </w:tr>
+      <w:tr>
+        <w:tc>
+          <w:tcPr>
+            <w:tcW w:type="dxa" w:w="4800"/>
+          </w:tcPr>
+          <w:p>
+            <w:r>
+              <w:t>BEX-08</w:t>
+            </w:r>
+          </w:p>
+        </w:tc>
+        <w:tc>
+          <w:tcPr>
+            <w:tcW w:type="dxa" w:w="4800"/>
+          </w:tcPr>
+          <w:p>
+            <w:r>
+              <w:t>"12 -&gt; 12 fails"</w:t>
+            </w:r>
+          </w:p>
+        </w:tc>
+        <w:tc>
+          <w:tcPr>
+            <w:tcW w:type="dxa" w:w="4800"/>
+          </w:tcPr>
+          <w:p>
+            <w:r>
+              <w:t>"12 -&gt; 15 fails"</w:t>
             </w:r>
           </w:p>
         </w:tc>
@@ -1611,7 +2059,7 @@
               <w:r>
                 <w:drawing>
                   <wp:inline xmlns:a="http://schemas.openxmlformats.org/drawingml/2006/main" xmlns:pic="http://schemas.openxmlformats.org/drawingml/2006/picture">
-                    <wp:extent cx="4480560" cy="5495366"/>
+                    <wp:extent cx="4480560" cy="909471"/>
                     <wp:docPr id="7" name="Picture 7"/>
                     <wp:cNvGraphicFramePr>
                       <a:graphicFrameLocks noChangeAspect="1"/>
@@ -1632,7 +2080,7 @@
                           <pic:spPr>
                             <a:xfrm>
                               <a:off x="0" y="0"/>
-                              <a:ext cx="4480560" cy="5495366"/>
+                              <a:ext cx="4480560" cy="909471"/>
                             </a:xfrm>
                             <a:prstGeom prst="rect"/>
                           </pic:spPr>
@@ -1652,7 +2100,7 @@
               <w:rPr>
                 <w:sz w:val="20"/>
               </w:rPr>
-              <w:t>Baseline behavior from trace-v1.</w:t>
+              <w:t>Baseline recommendation output at v1.</w:t>
             </w:r>
           </w:p>
           <w:p>
@@ -1666,7 +2114,7 @@
                 <w:sz w:val="22"/>
                 <w:shd w:fill="FFF200"/>
               </w:rPr>
-              <w:t>Policy delta</w:t>
+              <w:t>Recommendation delta</w:t>
             </w:r>
           </w:p>
           <w:p>
@@ -1717,7 +2165,7 @@
               <w:r>
                 <w:drawing>
                   <wp:inline xmlns:a="http://schemas.openxmlformats.org/drawingml/2006/main" xmlns:pic="http://schemas.openxmlformats.org/drawingml/2006/picture">
-                    <wp:extent cx="4480560" cy="5495366"/>
+                    <wp:extent cx="4480560" cy="909471"/>
                     <wp:docPr id="8" name="Picture 8"/>
                     <wp:cNvGraphicFramePr>
                       <a:graphicFrameLocks noChangeAspect="1"/>
@@ -1738,7 +2186,7 @@
                           <pic:spPr>
                             <a:xfrm>
                               <a:off x="0" y="0"/>
-                              <a:ext cx="4480560" cy="5495366"/>
+                              <a:ext cx="4480560" cy="909471"/>
                             </a:xfrm>
                             <a:prstGeom prst="rect"/>
                           </pic:spPr>
@@ -1758,7 +2206,7 @@
               <w:rPr>
                 <w:sz w:val="20"/>
               </w:rPr>
-              <w:t>Updated behavior from trace-v3.</w:t>
+              <w:t>Updated recommendation output at v3.</w:t>
             </w:r>
           </w:p>
           <w:p>
@@ -1772,7 +2220,7 @@
                 <w:sz w:val="22"/>
                 <w:shd w:fill="FFF200"/>
               </w:rPr>
-              <w:t>Policy delta</w:t>
+              <w:t>Recommendation delta</w:t>
             </w:r>
           </w:p>
           <w:p>
@@ -1807,7 +2255,7 @@
           <w:b/>
           <w:sz w:val="30"/>
         </w:rPr>
-        <w:t>E. Runtime Orchestration</w:t>
+        <w:t>E. Full Verdicts Output</w:t>
       </w:r>
     </w:p>
     <w:p>
@@ -1818,7 +2266,7 @@
         <w:t xml:space="preserve">The problem. </w:t>
       </w:r>
       <w:r>
-        <w:t>At baseline (trace-v), this section reflects earlier logic in rlaif_lab/runtime.py before the current control refinements.</w:t>
+        <w:t>At baseline (trace-v), this section reflects earlier logic in artifacts/verdicts_full.json before the current control refinements.</w:t>
       </w:r>
     </w:p>
     <w:p>
@@ -1829,7 +2277,7 @@
         <w:t xml:space="preserve">The change. </w:t>
       </w:r>
       <w:r>
-        <w:t>The latest commit (trace-v) applies 0 focused patch hunk(s), with +0 and -0 line changes in this file.</w:t>
+        <w:t>The latest commit (trace-v) applies 844 focused patch hunk(s), with +1999 and -1992 line changes in this file.</w:t>
       </w:r>
     </w:p>
     <w:p>
@@ -1840,7 +2288,7 @@
         <w:t xml:space="preserve">The effect. </w:t>
       </w:r>
       <w:r>
-        <w:t>Comparison now has commit-pinned before/after evidence and a structured delta table with 3 key setting/value changes.</w:t>
+        <w:t>Comparison now has commit-pinned before/after evidence and a structured delta table with 8 key setting/value changes.</w:t>
       </w:r>
     </w:p>
     <w:p>
@@ -1916,7 +2364,7 @@
           </w:tcPr>
           <w:p>
             <w:r>
-              <w:t>file_path</w:t>
+              <w:t>levers</w:t>
             </w:r>
           </w:p>
         </w:tc>
@@ -1926,7 +2374,7 @@
           </w:tcPr>
           <w:p>
             <w:r>
-              <w:t>rlaif_lab/runtime.py</w:t>
+              <w:t>[]</w:t>
             </w:r>
           </w:p>
         </w:tc>
@@ -1936,7 +2384,7 @@
           </w:tcPr>
           <w:p>
             <w:r>
-              <w:t>rlaif_lab/runtime.py</w:t>
+              <w:t>[</w:t>
             </w:r>
           </w:p>
         </w:tc>
@@ -1948,7 +2396,7 @@
           </w:tcPr>
           <w:p>
             <w:r>
-              <w:t>commit_ref</w:t>
+              <w:t>verdict</w:t>
             </w:r>
           </w:p>
         </w:tc>
@@ -1958,7 +2406,7 @@
           </w:tcPr>
           <w:p>
             <w:r>
-              <w:t>trace-v</w:t>
+              <w:t>"NA"</w:t>
             </w:r>
           </w:p>
         </w:tc>
@@ -1968,7 +2416,7 @@
           </w:tcPr>
           <w:p>
             <w:r>
-              <w:t>trace-v</w:t>
+              <w:t>"PASS"</w:t>
             </w:r>
           </w:p>
         </w:tc>
@@ -1980,7 +2428,7 @@
           </w:tcPr>
           <w:p>
             <w:r>
-              <w:t>line_delta</w:t>
+              <w:t>evidence</w:t>
             </w:r>
           </w:p>
         </w:tc>
@@ -1990,7 +2438,7 @@
           </w:tcPr>
           <w:p>
             <w:r>
-              <w:t>+0</w:t>
+              <w:t>"Turn 5: Agent says 'Is there anything else I can help you with today?'"</w:t>
             </w:r>
           </w:p>
         </w:tc>
@@ -2000,7 +2448,167 @@
           </w:tcPr>
           <w:p>
             <w:r>
-              <w:t>-0</w:t>
+              <w:t>"Turn 9: Agent says 'Is there anything else I can help you with today?'"</w:t>
+            </w:r>
+          </w:p>
+        </w:tc>
+      </w:tr>
+      <w:tr>
+        <w:tc>
+          <w:tcPr>
+            <w:tcW w:type="dxa" w:w="4800"/>
+          </w:tcPr>
+          <w:p>
+            <w:r>
+              <w:t>reason</w:t>
+            </w:r>
+          </w:p>
+        </w:tc>
+        <w:tc>
+          <w:tcPr>
+            <w:tcW w:type="dxa" w:w="4800"/>
+          </w:tcPr>
+          <w:p>
+            <w:r>
+              <w:t>"Enrollment was never attempted."</w:t>
+            </w:r>
+          </w:p>
+        </w:tc>
+        <w:tc>
+          <w:tcPr>
+            <w:tcW w:type="dxa" w:w="4800"/>
+          </w:tcPr>
+          <w:p>
+            <w:r>
+              <w:t>"Eligibility -&gt; full T&amp;C -&gt; explicit acceptance -&gt; enroll, in order."</w:t>
+            </w:r>
+          </w:p>
+        </w:tc>
+      </w:tr>
+      <w:tr>
+        <w:tc>
+          <w:tcPr>
+            <w:tcW w:type="dxa" w:w="4800"/>
+          </w:tcPr>
+          <w:p>
+            <w:r>
+              <w:t>call</w:t>
+            </w:r>
+          </w:p>
+        </w:tc>
+        <w:tc>
+          <w:tcPr>
+            <w:tcW w:type="dxa" w:w="4800"/>
+          </w:tcPr>
+          <w:p>
+            <w:r>
+              <w:t>transfer_to_agent"</w:t>
+            </w:r>
+          </w:p>
+        </w:tc>
+        <w:tc>
+          <w:tcPr>
+            <w:tcW w:type="dxa" w:w="4800"/>
+          </w:tcPr>
+          <w:p>
+            <w:r>
+              <w:t>enroll_paper_free_billing"</w:t>
+            </w:r>
+          </w:p>
+        </w:tc>
+      </w:tr>
+      <w:tr>
+        <w:tc>
+          <w:tcPr>
+            <w:tcW w:type="dxa" w:w="4800"/>
+          </w:tcPr>
+          <w:p>
+            <w:r>
+              <w:t>leak</w:t>
+            </w:r>
+          </w:p>
+        </w:tc>
+        <w:tc>
+          <w:tcPr>
+            <w:tcW w:type="dxa" w:w="4800"/>
+          </w:tcPr>
+          <w:p>
+            <w:r>
+              <w:t>transfer_to_agent"</w:t>
+            </w:r>
+          </w:p>
+        </w:tc>
+        <w:tc>
+          <w:tcPr>
+            <w:tcW w:type="dxa" w:w="4800"/>
+          </w:tcPr>
+          <w:p>
+            <w:r>
+              <w:t>transfer_to_agent"</w:t>
+            </w:r>
+          </w:p>
+        </w:tc>
+      </w:tr>
+      <w:tr>
+        <w:tc>
+          <w:tcPr>
+            <w:tcW w:type="dxa" w:w="4800"/>
+          </w:tcPr>
+          <w:p>
+            <w:r>
+              <w:t>output_leaks</w:t>
+            </w:r>
+          </w:p>
+        </w:tc>
+        <w:tc>
+          <w:tcPr>
+            <w:tcW w:type="dxa" w:w="4800"/>
+          </w:tcPr>
+          <w:p>
+            <w:r>
+              <w:t>6</w:t>
+            </w:r>
+          </w:p>
+        </w:tc>
+        <w:tc>
+          <w:tcPr>
+            <w:tcW w:type="dxa" w:w="4800"/>
+          </w:tcPr>
+          <w:p>
+            <w:r>
+              <w:t>0</w:t>
+            </w:r>
+          </w:p>
+        </w:tc>
+      </w:tr>
+      <w:tr>
+        <w:tc>
+          <w:tcPr>
+            <w:tcW w:type="dxa" w:w="4800"/>
+          </w:tcPr>
+          <w:p>
+            <w:r>
+              <w:t>overall_compliance_rate</w:t>
+            </w:r>
+          </w:p>
+        </w:tc>
+        <w:tc>
+          <w:tcPr>
+            <w:tcW w:type="dxa" w:w="4800"/>
+          </w:tcPr>
+          <w:p>
+            <w:r>
+              <w:t>0.1667</w:t>
+            </w:r>
+          </w:p>
+        </w:tc>
+        <w:tc>
+          <w:tcPr>
+            <w:tcW w:type="dxa" w:w="4800"/>
+          </w:tcPr>
+          <w:p>
+            <w:r>
+              <w:t>0.7143</w:t>
             </w:r>
           </w:p>
         </w:tc>
@@ -2051,7 +2659,7 @@
               <w:r>
                 <w:drawing>
                   <wp:inline xmlns:a="http://schemas.openxmlformats.org/drawingml/2006/main" xmlns:pic="http://schemas.openxmlformats.org/drawingml/2006/picture">
-                    <wp:extent cx="4480560" cy="5459398"/>
+                    <wp:extent cx="4480560" cy="1400175"/>
                     <wp:docPr id="9" name="Picture 9"/>
                     <wp:cNvGraphicFramePr>
                       <a:graphicFrameLocks noChangeAspect="1"/>
@@ -2072,7 +2680,7 @@
                           <pic:spPr>
                             <a:xfrm>
                               <a:off x="0" y="0"/>
-                              <a:ext cx="4480560" cy="5459398"/>
+                              <a:ext cx="4480560" cy="1400175"/>
                             </a:xfrm>
                             <a:prstGeom prst="rect"/>
                           </pic:spPr>
@@ -2092,7 +2700,7 @@
               <w:rPr>
                 <w:sz w:val="20"/>
               </w:rPr>
-              <w:t>Baseline behavior from trace-v1.</w:t>
+              <w:t>Baseline verdict output at v1.</w:t>
             </w:r>
           </w:p>
           <w:p>
@@ -2106,7 +2714,7 @@
                 <w:sz w:val="22"/>
                 <w:shd w:fill="FFF200"/>
               </w:rPr>
-              <w:t>Runtime delta</w:t>
+              <w:t>Verdict delta</w:t>
             </w:r>
           </w:p>
           <w:p>
@@ -2157,7 +2765,7 @@
               <w:r>
                 <w:drawing>
                   <wp:inline xmlns:a="http://schemas.openxmlformats.org/drawingml/2006/main" xmlns:pic="http://schemas.openxmlformats.org/drawingml/2006/picture">
-                    <wp:extent cx="4480560" cy="5459398"/>
+                    <wp:extent cx="4480560" cy="1043066"/>
                     <wp:docPr id="10" name="Picture 10"/>
                     <wp:cNvGraphicFramePr>
                       <a:graphicFrameLocks noChangeAspect="1"/>
@@ -2178,7 +2786,7 @@
                           <pic:spPr>
                             <a:xfrm>
                               <a:off x="0" y="0"/>
-                              <a:ext cx="4480560" cy="5459398"/>
+                              <a:ext cx="4480560" cy="1043066"/>
                             </a:xfrm>
                             <a:prstGeom prst="rect"/>
                           </pic:spPr>
@@ -2198,7 +2806,7 @@
               <w:rPr>
                 <w:sz w:val="20"/>
               </w:rPr>
-              <w:t>Updated behavior from trace-v3.</w:t>
+              <w:t>Updated verdict output at v3.</w:t>
             </w:r>
           </w:p>
           <w:p>
@@ -2212,7 +2820,7 @@
                 <w:sz w:val="22"/>
                 <w:shd w:fill="FFF200"/>
               </w:rPr>
-              <w:t>Runtime delta</w:t>
+              <w:t>Verdict delta</w:t>
             </w:r>
           </w:p>
           <w:p>
@@ -2220,446 +2828,6 @@
               <w:jc w:val="center"/>
             </w:pPr>
             <w:hyperlink r:id="rId28">
-              <w:r>
-                <w:rPr>
-                  <w:color w:val="1155CC"/>
-                  <w:u w:val="single"/>
-                </w:rPr>
-                <w:t>Open source on GitHub</w:t>
-              </w:r>
-            </w:hyperlink>
-          </w:p>
-        </w:tc>
-      </w:tr>
-    </w:tbl>
-    <w:p/>
-    <w:p>
-      <w:r>
-        <w:br w:type="page"/>
-      </w:r>
-    </w:p>
-    <w:p>
-      <w:pPr>
-        <w:jc w:val="center"/>
-      </w:pPr>
-      <w:r>
-        <w:rPr>
-          <w:b/>
-          <w:sz w:val="30"/>
-        </w:rPr>
-        <w:t>F. Registry and Tool Mapping</w:t>
-      </w:r>
-    </w:p>
-    <w:p>
-      <w:r>
-        <w:rPr>
-          <w:b/>
-        </w:rPr>
-        <w:t xml:space="preserve">The problem. </w:t>
-      </w:r>
-      <w:r>
-        <w:t>At baseline (trace-v), this section reflects earlier logic in rlaif_lab/registry.py before the current control refinements.</w:t>
-      </w:r>
-    </w:p>
-    <w:p>
-      <w:r>
-        <w:rPr>
-          <w:b/>
-        </w:rPr>
-        <w:t xml:space="preserve">The change. </w:t>
-      </w:r>
-      <w:r>
-        <w:t>The latest commit (trace-v) applies 0 focused patch hunk(s), with +0 and -0 line changes in this file.</w:t>
-      </w:r>
-    </w:p>
-    <w:p>
-      <w:r>
-        <w:rPr>
-          <w:b/>
-        </w:rPr>
-        <w:t xml:space="preserve">The effect. </w:t>
-      </w:r>
-      <w:r>
-        <w:t>Comparison now has commit-pinned before/after evidence and a structured delta table with 3 key setting/value changes.</w:t>
-      </w:r>
-    </w:p>
-    <w:p>
-      <w:r>
-        <w:rPr>
-          <w:b/>
-        </w:rPr>
-        <w:t>Code-change table</w:t>
-      </w:r>
-    </w:p>
-    <w:tbl>
-      <w:tblPr>
-        <w:tblStyle w:val="TableGrid"/>
-        <w:tblW w:type="auto" w:w="0"/>
-        <w:tblLook w:firstColumn="1" w:firstRow="1" w:lastColumn="0" w:lastRow="0" w:noHBand="0" w:noVBand="1" w:val="04A0"/>
-      </w:tblPr>
-      <w:tblGrid>
-        <w:gridCol w:w="4800"/>
-        <w:gridCol w:w="4800"/>
-        <w:gridCol w:w="4800"/>
-      </w:tblGrid>
-      <w:tr>
-        <w:tc>
-          <w:tcPr>
-            <w:tcW w:type="dxa" w:w="4800"/>
-            <w:shd w:val="clear" w:color="auto" w:fill="1F4E79"/>
-          </w:tcPr>
-          <w:p>
-            <w:r>
-              <w:rPr>
-                <w:b/>
-                <w:color w:val="FFFFFF"/>
-              </w:rPr>
-              <w:t>Setting</w:t>
-            </w:r>
-          </w:p>
-        </w:tc>
-        <w:tc>
-          <w:tcPr>
-            <w:tcW w:type="dxa" w:w="4800"/>
-            <w:shd w:val="clear" w:color="auto" w:fill="1F4E79"/>
-          </w:tcPr>
-          <w:p>
-            <w:r>
-              <w:rPr>
-                <w:b/>
-                <w:color w:val="FFFFFF"/>
-              </w:rPr>
-              <w:t>Before (baseline)</w:t>
-            </w:r>
-          </w:p>
-        </w:tc>
-        <w:tc>
-          <w:tcPr>
-            <w:tcW w:type="dxa" w:w="4800"/>
-            <w:shd w:val="clear" w:color="auto" w:fill="1F4E79"/>
-          </w:tcPr>
-          <w:p>
-            <w:r>
-              <w:rPr>
-                <w:b/>
-                <w:color w:val="FFFFFF"/>
-              </w:rPr>
-              <w:t>After (latest)</w:t>
-            </w:r>
-          </w:p>
-        </w:tc>
-      </w:tr>
-      <w:tr>
-        <w:tc>
-          <w:tcPr>
-            <w:tcW w:type="dxa" w:w="4800"/>
-          </w:tcPr>
-          <w:p>
-            <w:r>
-              <w:t>file_path</w:t>
-            </w:r>
-          </w:p>
-        </w:tc>
-        <w:tc>
-          <w:tcPr>
-            <w:tcW w:type="dxa" w:w="4800"/>
-          </w:tcPr>
-          <w:p>
-            <w:r>
-              <w:t>rlaif_lab/registry.py</w:t>
-            </w:r>
-          </w:p>
-        </w:tc>
-        <w:tc>
-          <w:tcPr>
-            <w:tcW w:type="dxa" w:w="4800"/>
-          </w:tcPr>
-          <w:p>
-            <w:r>
-              <w:t>rlaif_lab/registry.py</w:t>
-            </w:r>
-          </w:p>
-        </w:tc>
-      </w:tr>
-      <w:tr>
-        <w:tc>
-          <w:tcPr>
-            <w:tcW w:type="dxa" w:w="4800"/>
-          </w:tcPr>
-          <w:p>
-            <w:r>
-              <w:t>commit_ref</w:t>
-            </w:r>
-          </w:p>
-        </w:tc>
-        <w:tc>
-          <w:tcPr>
-            <w:tcW w:type="dxa" w:w="4800"/>
-          </w:tcPr>
-          <w:p>
-            <w:r>
-              <w:t>trace-v</w:t>
-            </w:r>
-          </w:p>
-        </w:tc>
-        <w:tc>
-          <w:tcPr>
-            <w:tcW w:type="dxa" w:w="4800"/>
-          </w:tcPr>
-          <w:p>
-            <w:r>
-              <w:t>trace-v</w:t>
-            </w:r>
-          </w:p>
-        </w:tc>
-      </w:tr>
-      <w:tr>
-        <w:tc>
-          <w:tcPr>
-            <w:tcW w:type="dxa" w:w="4800"/>
-          </w:tcPr>
-          <w:p>
-            <w:r>
-              <w:t>line_delta</w:t>
-            </w:r>
-          </w:p>
-        </w:tc>
-        <w:tc>
-          <w:tcPr>
-            <w:tcW w:type="dxa" w:w="4800"/>
-          </w:tcPr>
-          <w:p>
-            <w:r>
-              <w:t>+0</w:t>
-            </w:r>
-          </w:p>
-        </w:tc>
-        <w:tc>
-          <w:tcPr>
-            <w:tcW w:type="dxa" w:w="4800"/>
-          </w:tcPr>
-          <w:p>
-            <w:r>
-              <w:t>-0</w:t>
-            </w:r>
-          </w:p>
-        </w:tc>
-      </w:tr>
-    </w:tbl>
-    <w:p/>
-    <w:tbl>
-      <w:tblPr>
-        <w:tblStyle w:val="TableGrid"/>
-        <w:tblW w:type="auto" w:w="0"/>
-        <w:tblLook w:firstColumn="1" w:firstRow="1" w:lastColumn="0" w:lastRow="0" w:noHBand="0" w:noVBand="1" w:val="04A0"/>
-      </w:tblPr>
-      <w:tblGrid>
-        <w:gridCol w:w="8928"/>
-        <w:gridCol w:w="8928"/>
-      </w:tblGrid>
-      <w:tr>
-        <w:tc>
-          <w:tcPr>
-            <w:tcW w:type="dxa" w:w="7200"/>
-            <w:tcBorders>
-              <w:top w:val="single" w:sz="10" w:space="0" w:color="9DB4CC"/>
-              <w:left w:val="single" w:sz="10" w:space="0" w:color="9DB4CC"/>
-              <w:bottom w:val="single" w:sz="10" w:space="0" w:color="9DB4CC"/>
-              <w:right w:val="single" w:sz="10" w:space="0" w:color="9DB4CC"/>
-            </w:tcBorders>
-            <w:shd w:val="clear" w:color="auto" w:fill="F7FBFF"/>
-          </w:tcPr>
-          <w:p>
-            <w:pPr>
-              <w:jc w:val="center"/>
-            </w:pPr>
-            <w:r/>
-            <w:r>
-              <w:rPr>
-                <w:b/>
-                <w:sz w:val="32"/>
-              </w:rPr>
-              <w:t>Before (v1)</w:t>
-            </w:r>
-          </w:p>
-          <w:p>
-            <w:pPr>
-              <w:jc w:val="center"/>
-            </w:pPr>
-            <w:r/>
-            <w:hyperlink r:id="rId30">
-              <w:r>
-                <w:drawing>
-                  <wp:inline xmlns:a="http://schemas.openxmlformats.org/drawingml/2006/main" xmlns:pic="http://schemas.openxmlformats.org/drawingml/2006/picture">
-                    <wp:extent cx="4480560" cy="5513350"/>
-                    <wp:docPr id="11" name="Picture 11"/>
-                    <wp:cNvGraphicFramePr>
-                      <a:graphicFrameLocks noChangeAspect="1"/>
-                    </wp:cNvGraphicFramePr>
-                    <a:graphic>
-                      <a:graphicData uri="http://schemas.openxmlformats.org/drawingml/2006/picture">
-                        <pic:pic>
-                          <pic:nvPicPr>
-                            <pic:cNvPr id="0" name="pair_06_before.png"/>
-                            <pic:cNvPicPr/>
-                          </pic:nvPicPr>
-                          <pic:blipFill>
-                            <a:blip r:embed="rId29"/>
-                            <a:stretch>
-                              <a:fillRect/>
-                            </a:stretch>
-                          </pic:blipFill>
-                          <pic:spPr>
-                            <a:xfrm>
-                              <a:off x="0" y="0"/>
-                              <a:ext cx="4480560" cy="5513350"/>
-                            </a:xfrm>
-                            <a:prstGeom prst="rect"/>
-                          </pic:spPr>
-                        </pic:pic>
-                      </a:graphicData>
-                    </a:graphic>
-                  </wp:inline>
-                </w:drawing>
-              </w:r>
-            </w:hyperlink>
-          </w:p>
-          <w:p>
-            <w:pPr>
-              <w:jc w:val="center"/>
-            </w:pPr>
-            <w:r>
-              <w:rPr>
-                <w:sz w:val="20"/>
-              </w:rPr>
-              <w:t>Baseline behavior from trace-v1.</w:t>
-            </w:r>
-          </w:p>
-          <w:p>
-            <w:pPr>
-              <w:jc w:val="center"/>
-            </w:pPr>
-            <w:r>
-              <w:rPr>
-                <w:b/>
-                <w:i/>
-                <w:sz w:val="22"/>
-                <w:shd w:fill="FFF200"/>
-              </w:rPr>
-              <w:t>Registry delta</w:t>
-            </w:r>
-          </w:p>
-          <w:p>
-            <w:pPr>
-              <w:jc w:val="center"/>
-            </w:pPr>
-            <w:hyperlink r:id="rId30">
-              <w:r>
-                <w:rPr>
-                  <w:color w:val="1155CC"/>
-                  <w:u w:val="single"/>
-                </w:rPr>
-                <w:t>Open source on GitHub</w:t>
-              </w:r>
-            </w:hyperlink>
-          </w:p>
-        </w:tc>
-        <w:tc>
-          <w:tcPr>
-            <w:tcW w:type="dxa" w:w="7200"/>
-            <w:tcBorders>
-              <w:top w:val="single" w:sz="10" w:space="0" w:color="9DB4CC"/>
-              <w:left w:val="single" w:sz="10" w:space="0" w:color="9DB4CC"/>
-              <w:bottom w:val="single" w:sz="10" w:space="0" w:color="9DB4CC"/>
-              <w:right w:val="single" w:sz="10" w:space="0" w:color="9DB4CC"/>
-            </w:tcBorders>
-            <w:shd w:val="clear" w:color="auto" w:fill="F7FBFF"/>
-          </w:tcPr>
-          <w:p>
-            <w:pPr>
-              <w:jc w:val="center"/>
-            </w:pPr>
-            <w:r/>
-            <w:r>
-              <w:rPr>
-                <w:b/>
-                <w:sz w:val="32"/>
-              </w:rPr>
-              <w:t>After (v3)</w:t>
-            </w:r>
-          </w:p>
-          <w:p>
-            <w:pPr>
-              <w:jc w:val="center"/>
-            </w:pPr>
-            <w:r/>
-            <w:hyperlink r:id="rId32">
-              <w:r>
-                <w:drawing>
-                  <wp:inline xmlns:a="http://schemas.openxmlformats.org/drawingml/2006/main" xmlns:pic="http://schemas.openxmlformats.org/drawingml/2006/picture">
-                    <wp:extent cx="4480560" cy="5513350"/>
-                    <wp:docPr id="12" name="Picture 12"/>
-                    <wp:cNvGraphicFramePr>
-                      <a:graphicFrameLocks noChangeAspect="1"/>
-                    </wp:cNvGraphicFramePr>
-                    <a:graphic>
-                      <a:graphicData uri="http://schemas.openxmlformats.org/drawingml/2006/picture">
-                        <pic:pic>
-                          <pic:nvPicPr>
-                            <pic:cNvPr id="0" name="pair_06_after.png"/>
-                            <pic:cNvPicPr/>
-                          </pic:nvPicPr>
-                          <pic:blipFill>
-                            <a:blip r:embed="rId31"/>
-                            <a:stretch>
-                              <a:fillRect/>
-                            </a:stretch>
-                          </pic:blipFill>
-                          <pic:spPr>
-                            <a:xfrm>
-                              <a:off x="0" y="0"/>
-                              <a:ext cx="4480560" cy="5513350"/>
-                            </a:xfrm>
-                            <a:prstGeom prst="rect"/>
-                          </pic:spPr>
-                        </pic:pic>
-                      </a:graphicData>
-                    </a:graphic>
-                  </wp:inline>
-                </w:drawing>
-              </w:r>
-            </w:hyperlink>
-          </w:p>
-          <w:p>
-            <w:pPr>
-              <w:jc w:val="center"/>
-            </w:pPr>
-            <w:r>
-              <w:rPr>
-                <w:sz w:val="20"/>
-              </w:rPr>
-              <w:t>Updated behavior from trace-v3.</w:t>
-            </w:r>
-          </w:p>
-          <w:p>
-            <w:pPr>
-              <w:jc w:val="center"/>
-            </w:pPr>
-            <w:r>
-              <w:rPr>
-                <w:b/>
-                <w:i/>
-                <w:sz w:val="22"/>
-                <w:shd w:fill="FFF200"/>
-              </w:rPr>
-              <w:t>Registry delta</w:t>
-            </w:r>
-          </w:p>
-          <w:p>
-            <w:pPr>
-              <w:jc w:val="center"/>
-            </w:pPr>
-            <w:hyperlink r:id="rId32">
               <w:r>
                 <w:rPr>
                   <w:color w:val="1155CC"/>

</xml_diff>

<commit_message>
Align v3 report to taxonomy evidence lines and lock-safe executive output
</commit_message>
<xml_diff>
--- a/output/rlaif_before_after.docx
+++ b/output/rlaif_before_after.docx
@@ -47,7 +47,7 @@
           <w:b/>
           <w:sz w:val="30"/>
         </w:rPr>
-        <w:t>A. Trace History Narrative</w:t>
+        <w:t>A. Taxonomy Lever Outcome (v1 vs v3)</w:t>
       </w:r>
     </w:p>
     <w:p>
@@ -259,7 +259,7 @@
               <w:r>
                 <w:drawing>
                   <wp:inline xmlns:a="http://schemas.openxmlformats.org/drawingml/2006/main" xmlns:pic="http://schemas.openxmlformats.org/drawingml/2006/picture">
-                    <wp:extent cx="4480560" cy="596038"/>
+                    <wp:extent cx="4480560" cy="238929"/>
                     <wp:docPr id="1" name="Picture 1"/>
                     <wp:cNvGraphicFramePr>
                       <a:graphicFrameLocks noChangeAspect="1"/>
@@ -280,7 +280,7 @@
                           <pic:spPr>
                             <a:xfrm>
                               <a:off x="0" y="0"/>
-                              <a:ext cx="4480560" cy="596038"/>
+                              <a:ext cx="4480560" cy="238929"/>
                             </a:xfrm>
                             <a:prstGeom prst="rect"/>
                           </pic:spPr>
@@ -300,7 +300,7 @@
               <w:rPr>
                 <w:sz w:val="20"/>
               </w:rPr>
-              <w:t>Baseline trace-history narrative at v1.</w:t>
+              <w:t>Baseline metrics before taxonomy improvements.</w:t>
             </w:r>
           </w:p>
           <w:p>
@@ -314,7 +314,7 @@
                 <w:sz w:val="22"/>
                 <w:shd w:fill="FFF200"/>
               </w:rPr>
-              <w:t>Narrative and governance delta</w:t>
+              <w:t>Taxonomy lift baseline</w:t>
             </w:r>
           </w:p>
           <w:p>
@@ -365,7 +365,7 @@
               <w:r>
                 <w:drawing>
                   <wp:inline xmlns:a="http://schemas.openxmlformats.org/drawingml/2006/main" xmlns:pic="http://schemas.openxmlformats.org/drawingml/2006/picture">
-                    <wp:extent cx="4480560" cy="2404704"/>
+                    <wp:extent cx="4480560" cy="238929"/>
                     <wp:docPr id="2" name="Picture 2"/>
                     <wp:cNvGraphicFramePr>
                       <a:graphicFrameLocks noChangeAspect="1"/>
@@ -386,7 +386,7 @@
                           <pic:spPr>
                             <a:xfrm>
                               <a:off x="0" y="0"/>
-                              <a:ext cx="4480560" cy="2404704"/>
+                              <a:ext cx="4480560" cy="238929"/>
                             </a:xfrm>
                             <a:prstGeom prst="rect"/>
                           </pic:spPr>
@@ -406,7 +406,7 @@
               <w:rPr>
                 <w:sz w:val="20"/>
               </w:rPr>
-              <w:t>Updated trace-history narrative at v3.</w:t>
+              <w:t>v3 taxonomy section with routing-accuracy lift and measured impact.</w:t>
             </w:r>
           </w:p>
           <w:p>
@@ -420,7 +420,7 @@
                 <w:sz w:val="22"/>
                 <w:shd w:fill="FFF200"/>
               </w:rPr>
-              <w:t>Narrative and governance delta</w:t>
+              <w:t>Taxonomy lift in v3</w:t>
             </w:r>
           </w:p>
           <w:p>
@@ -455,7 +455,7 @@
           <w:b/>
           <w:sz w:val="30"/>
         </w:rPr>
-        <w:t>B. Cycle Summary Output</w:t>
+        <w:t>B. Routing Behavior Evidence (verdicts)</w:t>
       </w:r>
     </w:p>
     <w:p>
@@ -466,7 +466,7 @@
         <w:t xml:space="preserve">The problem. </w:t>
       </w:r>
       <w:r>
-        <w:t>At baseline (trace-v), this section reflects earlier logic in artifacts/cycle_summary.json before the current control refinements.</w:t>
+        <w:t>At baseline (trace-v), this section reflects earlier logic in artifacts/verdicts_full.json before the current control refinements.</w:t>
       </w:r>
     </w:p>
     <w:p>
@@ -477,7 +477,7 @@
         <w:t xml:space="preserve">The change. </w:t>
       </w:r>
       <w:r>
-        <w:t>The latest commit (trace-v) applies 21 focused patch hunk(s), with +42 and -45 line changes in this file.</w:t>
+        <w:t>The latest commit (trace-v) applies 844 focused patch hunk(s), with +1999 and -1992 line changes in this file.</w:t>
       </w:r>
     </w:p>
     <w:p>
@@ -564,7 +564,7 @@
           </w:tcPr>
           <w:p>
             <w:r>
-              <w:t>deployed_levers</w:t>
+              <w:t>levers</w:t>
             </w:r>
           </w:p>
         </w:tc>
@@ -596,7 +596,7 @@
           </w:tcPr>
           <w:p>
             <w:r>
-              <w:t>avg_compliance_rate</w:t>
+              <w:t>verdict</w:t>
             </w:r>
           </w:p>
         </w:tc>
@@ -606,7 +606,7 @@
           </w:tcPr>
           <w:p>
             <w:r>
-              <w:t>0.381</w:t>
+              <w:t>"NA"</w:t>
             </w:r>
           </w:p>
         </w:tc>
@@ -616,7 +616,7 @@
           </w:tcPr>
           <w:p>
             <w:r>
-              <w:t>0.577</w:t>
+              <w:t>"PASS"</w:t>
             </w:r>
           </w:p>
         </w:tc>
@@ -628,7 +628,7 @@
           </w:tcPr>
           <w:p>
             <w:r>
-              <w:t>action_completion_rate</w:t>
+              <w:t>evidence</w:t>
             </w:r>
           </w:p>
         </w:tc>
@@ -638,7 +638,7 @@
           </w:tcPr>
           <w:p>
             <w:r>
-              <w:t>0.45</w:t>
+              <w:t>"Turn 5: Agent says 'Is there anything else I can help you with today?'"</w:t>
             </w:r>
           </w:p>
         </w:tc>
@@ -648,7 +648,7 @@
           </w:tcPr>
           <w:p>
             <w:r>
-              <w:t>1.0</w:t>
+              <w:t>"Turn 9: Agent says 'Is there anything else I can help you with today?'"</w:t>
             </w:r>
           </w:p>
         </w:tc>
@@ -660,7 +660,7 @@
           </w:tcPr>
           <w:p>
             <w:r>
-              <w:t>REPETITIVE_LOOP</w:t>
+              <w:t>reason</w:t>
             </w:r>
           </w:p>
         </w:tc>
@@ -670,7 +670,7 @@
           </w:tcPr>
           <w:p>
             <w:r>
-              <w:t>33</w:t>
+              <w:t>"Enrollment was never attempted."</w:t>
             </w:r>
           </w:p>
         </w:tc>
@@ -680,7 +680,7 @@
           </w:tcPr>
           <w:p>
             <w:r>
-              <w:t>(empty)</w:t>
+              <w:t>"Eligibility -&gt; full T&amp;C -&gt; explicit acceptance -&gt; enroll, in order."</w:t>
             </w:r>
           </w:p>
         </w:tc>
@@ -692,7 +692,7 @@
           </w:tcPr>
           <w:p>
             <w:r>
-              <w:t>LIVE_AGENT_HANDOFF</w:t>
+              <w:t>call</w:t>
             </w:r>
           </w:p>
         </w:tc>
@@ -702,7 +702,7 @@
           </w:tcPr>
           <w:p>
             <w:r>
-              <w:t>23</w:t>
+              <w:t>transfer_to_agent"</w:t>
             </w:r>
           </w:p>
         </w:tc>
@@ -712,7 +712,7 @@
           </w:tcPr>
           <w:p>
             <w:r>
-              <w:t>30</w:t>
+              <w:t>enroll_paper_free_billing"</w:t>
             </w:r>
           </w:p>
         </w:tc>
@@ -724,7 +724,7 @@
           </w:tcPr>
           <w:p>
             <w:r>
-              <w:t>RESOLVED</w:t>
+              <w:t>leak</w:t>
             </w:r>
           </w:p>
         </w:tc>
@@ -734,7 +734,7 @@
           </w:tcPr>
           <w:p>
             <w:r>
-              <w:t>4</w:t>
+              <w:t>transfer_to_agent"</w:t>
             </w:r>
           </w:p>
         </w:tc>
@@ -744,7 +744,7 @@
           </w:tcPr>
           <w:p>
             <w:r>
-              <w:t>30</w:t>
+              <w:t>transfer_to_agent"</w:t>
             </w:r>
           </w:p>
         </w:tc>
@@ -756,7 +756,7 @@
           </w:tcPr>
           <w:p>
             <w:r>
-              <w:t>GEN-02</w:t>
+              <w:t>output_leaks</w:t>
             </w:r>
           </w:p>
         </w:tc>
@@ -766,7 +766,7 @@
           </w:tcPr>
           <w:p>
             <w:r>
-              <w:t>"33 -&gt; 33 fails"</w:t>
+              <w:t>6</w:t>
             </w:r>
           </w:p>
         </w:tc>
@@ -776,7 +776,7 @@
           </w:tcPr>
           <w:p>
             <w:r>
-              <w:t>"33 -&gt; 30 fails"</w:t>
+              <w:t>0</w:t>
             </w:r>
           </w:p>
         </w:tc>
@@ -788,7 +788,7 @@
           </w:tcPr>
           <w:p>
             <w:r>
-              <w:t>GEN-04</w:t>
+              <w:t>overall_compliance_rate</w:t>
             </w:r>
           </w:p>
         </w:tc>
@@ -798,7 +798,7 @@
           </w:tcPr>
           <w:p>
             <w:r>
-              <w:t>"11 -&gt; 11 fails"</w:t>
+              <w:t>0.1667</w:t>
             </w:r>
           </w:p>
         </w:tc>
@@ -808,7 +808,7 @@
           </w:tcPr>
           <w:p>
             <w:r>
-              <w:t>"11 -&gt; 0 fails"</w:t>
+              <w:t>0.7143</w:t>
             </w:r>
           </w:p>
         </w:tc>
@@ -859,7 +859,7 @@
               <w:r>
                 <w:drawing>
                   <wp:inline xmlns:a="http://schemas.openxmlformats.org/drawingml/2006/main" xmlns:pic="http://schemas.openxmlformats.org/drawingml/2006/picture">
-                    <wp:extent cx="4480560" cy="1130417"/>
+                    <wp:extent cx="4480560" cy="9397872"/>
                     <wp:docPr id="3" name="Picture 3"/>
                     <wp:cNvGraphicFramePr>
                       <a:graphicFrameLocks noChangeAspect="1"/>
@@ -880,7 +880,7 @@
                           <pic:spPr>
                             <a:xfrm>
                               <a:off x="0" y="0"/>
-                              <a:ext cx="4480560" cy="1130417"/>
+                              <a:ext cx="4480560" cy="9397872"/>
                             </a:xfrm>
                             <a:prstGeom prst="rect"/>
                           </pic:spPr>
@@ -900,7 +900,7 @@
               <w:rPr>
                 <w:sz w:val="20"/>
               </w:rPr>
-              <w:t>Baseline cycle summary output at v1.</w:t>
+              <w:t>v1 shows repeated billing_explainer misroutes in rationale/path evidence.</w:t>
             </w:r>
           </w:p>
           <w:p>
@@ -914,7 +914,7 @@
                 <w:sz w:val="22"/>
                 <w:shd w:fill="FFF200"/>
               </w:rPr>
-              <w:t>Cycle summary delta</w:t>
+              <w:t>Misroute pattern before taxonomy</w:t>
             </w:r>
           </w:p>
           <w:p>
@@ -965,7 +965,7 @@
               <w:r>
                 <w:drawing>
                   <wp:inline xmlns:a="http://schemas.openxmlformats.org/drawingml/2006/main" xmlns:pic="http://schemas.openxmlformats.org/drawingml/2006/picture">
-                    <wp:extent cx="4480560" cy="1130417"/>
+                    <wp:extent cx="4480560" cy="10245684"/>
                     <wp:docPr id="4" name="Picture 4"/>
                     <wp:cNvGraphicFramePr>
                       <a:graphicFrameLocks noChangeAspect="1"/>
@@ -986,7 +986,7 @@
                           <pic:spPr>
                             <a:xfrm>
                               <a:off x="0" y="0"/>
-                              <a:ext cx="4480560" cy="1130417"/>
+                              <a:ext cx="4480560" cy="10245684"/>
                             </a:xfrm>
                             <a:prstGeom prst="rect"/>
                           </pic:spPr>
@@ -1006,7 +1006,7 @@
               <w:rPr>
                 <w:sz w:val="20"/>
               </w:rPr>
-              <w:t>Updated cycle summary output at v3.</w:t>
+              <w:t>v3 shows improved route selection (including due_date_changer where appropriate).</w:t>
             </w:r>
           </w:p>
           <w:p>
@@ -1020,7 +1020,7 @@
                 <w:sz w:val="22"/>
                 <w:shd w:fill="FFF200"/>
               </w:rPr>
-              <w:t>Cycle summary delta</w:t>
+              <w:t>Routing corrected by taxonomy</w:t>
             </w:r>
           </w:p>
           <w:p>
@@ -1055,607 +1055,7 @@
           <w:b/>
           <w:sz w:val="30"/>
         </w:rPr>
-        <w:t>C. Preference Pairs Dataset</w:t>
-      </w:r>
-    </w:p>
-    <w:p>
-      <w:r>
-        <w:rPr>
-          <w:b/>
-        </w:rPr>
-        <w:t xml:space="preserve">The problem. </w:t>
-      </w:r>
-      <w:r>
-        <w:t>At baseline (trace-v), this section reflects earlier logic in artifacts/preference_pairs.json before the current control refinements.</w:t>
-      </w:r>
-    </w:p>
-    <w:p>
-      <w:r>
-        <w:rPr>
-          <w:b/>
-        </w:rPr>
-        <w:t xml:space="preserve">The change. </w:t>
-      </w:r>
-      <w:r>
-        <w:t>The latest commit (trace-v) applies 1 focused patch hunk(s), with +1759 and -1 line changes in this file.</w:t>
-      </w:r>
-    </w:p>
-    <w:p>
-      <w:r>
-        <w:rPr>
-          <w:b/>
-        </w:rPr>
-        <w:t xml:space="preserve">The effect. </w:t>
-      </w:r>
-      <w:r>
-        <w:t>Comparison now has commit-pinned before/after evidence and a structured delta table with 8 key setting/value changes.</w:t>
-      </w:r>
-    </w:p>
-    <w:p>
-      <w:r>
-        <w:rPr>
-          <w:b/>
-        </w:rPr>
-        <w:t>Code-change table</w:t>
-      </w:r>
-    </w:p>
-    <w:tbl>
-      <w:tblPr>
-        <w:tblStyle w:val="TableGrid"/>
-        <w:tblW w:type="auto" w:w="0"/>
-        <w:tblLook w:firstColumn="1" w:firstRow="1" w:lastColumn="0" w:lastRow="0" w:noHBand="0" w:noVBand="1" w:val="04A0"/>
-      </w:tblPr>
-      <w:tblGrid>
-        <w:gridCol w:w="4800"/>
-        <w:gridCol w:w="4800"/>
-        <w:gridCol w:w="4800"/>
-      </w:tblGrid>
-      <w:tr>
-        <w:tc>
-          <w:tcPr>
-            <w:tcW w:type="dxa" w:w="4800"/>
-            <w:shd w:val="clear" w:color="auto" w:fill="1F4E79"/>
-          </w:tcPr>
-          <w:p>
-            <w:r>
-              <w:rPr>
-                <w:b/>
-                <w:color w:val="FFFFFF"/>
-              </w:rPr>
-              <w:t>Setting</w:t>
-            </w:r>
-          </w:p>
-        </w:tc>
-        <w:tc>
-          <w:tcPr>
-            <w:tcW w:type="dxa" w:w="4800"/>
-            <w:shd w:val="clear" w:color="auto" w:fill="1F4E79"/>
-          </w:tcPr>
-          <w:p>
-            <w:r>
-              <w:rPr>
-                <w:b/>
-                <w:color w:val="FFFFFF"/>
-              </w:rPr>
-              <w:t>Before (baseline)</w:t>
-            </w:r>
-          </w:p>
-        </w:tc>
-        <w:tc>
-          <w:tcPr>
-            <w:tcW w:type="dxa" w:w="4800"/>
-            <w:shd w:val="clear" w:color="auto" w:fill="1F4E79"/>
-          </w:tcPr>
-          <w:p>
-            <w:r>
-              <w:rPr>
-                <w:b/>
-                <w:color w:val="FFFFFF"/>
-              </w:rPr>
-              <w:t>After (latest)</w:t>
-            </w:r>
-          </w:p>
-        </w:tc>
-      </w:tr>
-      <w:tr>
-        <w:tc>
-          <w:tcPr>
-            <w:tcW w:type="dxa" w:w="4800"/>
-          </w:tcPr>
-          <w:p>
-            <w:r>
-              <w:t>pair_id</w:t>
-            </w:r>
-          </w:p>
-        </w:tc>
-        <w:tc>
-          <w:tcPr>
-            <w:tcW w:type="dxa" w:w="4800"/>
-          </w:tcPr>
-          <w:p>
-            <w:r>
-              <w:t>(empty)</w:t>
-            </w:r>
-          </w:p>
-        </w:tc>
-        <w:tc>
-          <w:tcPr>
-            <w:tcW w:type="dxa" w:w="4800"/>
-          </w:tcPr>
-          <w:p>
-            <w:r>
-              <w:t>"pp-ep-0059"</w:t>
-            </w:r>
-          </w:p>
-        </w:tc>
-      </w:tr>
-      <w:tr>
-        <w:tc>
-          <w:tcPr>
-            <w:tcW w:type="dxa" w:w="4800"/>
-          </w:tcPr>
-          <w:p>
-            <w:r>
-              <w:t>episode</w:t>
-            </w:r>
-          </w:p>
-        </w:tc>
-        <w:tc>
-          <w:tcPr>
-            <w:tcW w:type="dxa" w:w="4800"/>
-          </w:tcPr>
-          <w:p>
-            <w:r>
-              <w:t>(empty)</w:t>
-            </w:r>
-          </w:p>
-        </w:tc>
-        <w:tc>
-          <w:tcPr>
-            <w:tcW w:type="dxa" w:w="4800"/>
-          </w:tcPr>
-          <w:p>
-            <w:r>
-              <w:t>"ep-0059"</w:t>
-            </w:r>
-          </w:p>
-        </w:tc>
-      </w:tr>
-      <w:tr>
-        <w:tc>
-          <w:tcPr>
-            <w:tcW w:type="dxa" w:w="4800"/>
-          </w:tcPr>
-          <w:p>
-            <w:r>
-              <w:t>journey</w:t>
-            </w:r>
-          </w:p>
-        </w:tc>
-        <w:tc>
-          <w:tcPr>
-            <w:tcW w:type="dxa" w:w="4800"/>
-          </w:tcPr>
-          <w:p>
-            <w:r>
-              <w:t>(empty)</w:t>
-            </w:r>
-          </w:p>
-        </w:tc>
-        <w:tc>
-          <w:tcPr>
-            <w:tcW w:type="dxa" w:w="4800"/>
-          </w:tcPr>
-          <w:p>
-            <w:r>
-              <w:t>"gen"</w:t>
-            </w:r>
-          </w:p>
-        </w:tc>
-      </w:tr>
-      <w:tr>
-        <w:tc>
-          <w:tcPr>
-            <w:tcW w:type="dxa" w:w="4800"/>
-          </w:tcPr>
-          <w:p>
-            <w:r>
-              <w:t>utterance</w:t>
-            </w:r>
-          </w:p>
-        </w:tc>
-        <w:tc>
-          <w:tcPr>
-            <w:tcW w:type="dxa" w:w="4800"/>
-          </w:tcPr>
-          <w:p>
-            <w:r>
-              <w:t>(empty)</w:t>
-            </w:r>
-          </w:p>
-        </w:tc>
-        <w:tc>
-          <w:tcPr>
-            <w:tcW w:type="dxa" w:w="4800"/>
-          </w:tcPr>
-          <w:p>
-            <w:r>
-              <w:t>"I want to talk to a person. Also what is this $9.99 charge, and I need a new phone."</w:t>
-            </w:r>
-          </w:p>
-        </w:tc>
-      </w:tr>
-      <w:tr>
-        <w:tc>
-          <w:tcPr>
-            <w:tcW w:type="dxa" w:w="4800"/>
-          </w:tcPr>
-          <w:p>
-            <w:r>
-              <w:t>rejected</w:t>
-            </w:r>
-          </w:p>
-        </w:tc>
-        <w:tc>
-          <w:tcPr>
-            <w:tcW w:type="dxa" w:w="4800"/>
-          </w:tcPr>
-          <w:p>
-            <w:r>
-              <w:t>(empty)</w:t>
-            </w:r>
-          </w:p>
-        </w:tc>
-        <w:tc>
-          <w:tcPr>
-            <w:tcW w:type="dxa" w:w="4800"/>
-          </w:tcPr>
-          <w:p>
-            <w:r>
-              <w:t>{</w:t>
-            </w:r>
-          </w:p>
-        </w:tc>
-      </w:tr>
-      <w:tr>
-        <w:tc>
-          <w:tcPr>
-            <w:tcW w:type="dxa" w:w="4800"/>
-          </w:tcPr>
-          <w:p>
-            <w:r>
-              <w:t>levers</w:t>
-            </w:r>
-          </w:p>
-        </w:tc>
-        <w:tc>
-          <w:tcPr>
-            <w:tcW w:type="dxa" w:w="4800"/>
-          </w:tcPr>
-          <w:p>
-            <w:r>
-              <w:t>(empty)</w:t>
-            </w:r>
-          </w:p>
-        </w:tc>
-        <w:tc>
-          <w:tcPr>
-            <w:tcW w:type="dxa" w:w="4800"/>
-          </w:tcPr>
-          <w:p>
-            <w:r>
-              <w:t>[</w:t>
-            </w:r>
-          </w:p>
-        </w:tc>
-      </w:tr>
-      <w:tr>
-        <w:tc>
-          <w:tcPr>
-            <w:tcW w:type="dxa" w:w="4800"/>
-          </w:tcPr>
-          <w:p>
-            <w:r>
-              <w:t>weighted</w:t>
-            </w:r>
-          </w:p>
-        </w:tc>
-        <w:tc>
-          <w:tcPr>
-            <w:tcW w:type="dxa" w:w="4800"/>
-          </w:tcPr>
-          <w:p>
-            <w:r>
-              <w:t>(empty)</w:t>
-            </w:r>
-          </w:p>
-        </w:tc>
-        <w:tc>
-          <w:tcPr>
-            <w:tcW w:type="dxa" w:w="4800"/>
-          </w:tcPr>
-          <w:p>
-            <w:r>
-              <w:t>2.35</w:t>
-            </w:r>
-          </w:p>
-        </w:tc>
-      </w:tr>
-      <w:tr>
-        <w:tc>
-          <w:tcPr>
-            <w:tcW w:type="dxa" w:w="4800"/>
-          </w:tcPr>
-          <w:p>
-            <w:r>
-              <w:t>verdict</w:t>
-            </w:r>
-          </w:p>
-        </w:tc>
-        <w:tc>
-          <w:tcPr>
-            <w:tcW w:type="dxa" w:w="4800"/>
-          </w:tcPr>
-          <w:p>
-            <w:r>
-              <w:t>(empty)</w:t>
-            </w:r>
-          </w:p>
-        </w:tc>
-        <w:tc>
-          <w:tcPr>
-            <w:tcW w:type="dxa" w:w="4800"/>
-          </w:tcPr>
-          <w:p>
-            <w:r>
-              <w:t>"Rejected"</w:t>
-            </w:r>
-          </w:p>
-        </w:tc>
-      </w:tr>
-    </w:tbl>
-    <w:p/>
-    <w:tbl>
-      <w:tblPr>
-        <w:tblStyle w:val="TableGrid"/>
-        <w:tblW w:type="auto" w:w="0"/>
-        <w:tblLook w:firstColumn="1" w:firstRow="1" w:lastColumn="0" w:lastRow="0" w:noHBand="0" w:noVBand="1" w:val="04A0"/>
-      </w:tblPr>
-      <w:tblGrid>
-        <w:gridCol w:w="8928"/>
-        <w:gridCol w:w="8928"/>
-      </w:tblGrid>
-      <w:tr>
-        <w:tc>
-          <w:tcPr>
-            <w:tcW w:type="dxa" w:w="7200"/>
-            <w:tcBorders>
-              <w:top w:val="single" w:sz="10" w:space="0" w:color="9DB4CC"/>
-              <w:left w:val="single" w:sz="10" w:space="0" w:color="9DB4CC"/>
-              <w:bottom w:val="single" w:sz="10" w:space="0" w:color="9DB4CC"/>
-              <w:right w:val="single" w:sz="10" w:space="0" w:color="9DB4CC"/>
-            </w:tcBorders>
-            <w:shd w:val="clear" w:color="auto" w:fill="F7FBFF"/>
-          </w:tcPr>
-          <w:p>
-            <w:pPr>
-              <w:jc w:val="center"/>
-            </w:pPr>
-            <w:r/>
-            <w:r>
-              <w:rPr>
-                <w:b/>
-                <w:sz w:val="32"/>
-              </w:rPr>
-              <w:t>Before (v1)</w:t>
-            </w:r>
-          </w:p>
-          <w:p>
-            <w:pPr>
-              <w:jc w:val="center"/>
-            </w:pPr>
-            <w:r/>
-            <w:hyperlink r:id="rId18">
-              <w:r>
-                <w:drawing>
-                  <wp:inline xmlns:a="http://schemas.openxmlformats.org/drawingml/2006/main" xmlns:pic="http://schemas.openxmlformats.org/drawingml/2006/picture">
-                    <wp:extent cx="4480560" cy="149009"/>
-                    <wp:docPr id="5" name="Picture 5"/>
-                    <wp:cNvGraphicFramePr>
-                      <a:graphicFrameLocks noChangeAspect="1"/>
-                    </wp:cNvGraphicFramePr>
-                    <a:graphic>
-                      <a:graphicData uri="http://schemas.openxmlformats.org/drawingml/2006/picture">
-                        <pic:pic>
-                          <pic:nvPicPr>
-                            <pic:cNvPr id="0" name="pair_03_before.png"/>
-                            <pic:cNvPicPr/>
-                          </pic:nvPicPr>
-                          <pic:blipFill>
-                            <a:blip r:embed="rId17"/>
-                            <a:stretch>
-                              <a:fillRect/>
-                            </a:stretch>
-                          </pic:blipFill>
-                          <pic:spPr>
-                            <a:xfrm>
-                              <a:off x="0" y="0"/>
-                              <a:ext cx="4480560" cy="149009"/>
-                            </a:xfrm>
-                            <a:prstGeom prst="rect"/>
-                          </pic:spPr>
-                        </pic:pic>
-                      </a:graphicData>
-                    </a:graphic>
-                  </wp:inline>
-                </w:drawing>
-              </w:r>
-            </w:hyperlink>
-          </w:p>
-          <w:p>
-            <w:pPr>
-              <w:jc w:val="center"/>
-            </w:pPr>
-            <w:r>
-              <w:rPr>
-                <w:sz w:val="20"/>
-              </w:rPr>
-              <w:t>Baseline preference-pair records at v1.</w:t>
-            </w:r>
-          </w:p>
-          <w:p>
-            <w:pPr>
-              <w:jc w:val="center"/>
-            </w:pPr>
-            <w:r>
-              <w:rPr>
-                <w:b/>
-                <w:i/>
-                <w:sz w:val="22"/>
-                <w:shd w:fill="FFF200"/>
-              </w:rPr>
-              <w:t>Preference data delta</w:t>
-            </w:r>
-          </w:p>
-          <w:p>
-            <w:pPr>
-              <w:jc w:val="center"/>
-            </w:pPr>
-            <w:hyperlink r:id="rId18">
-              <w:r>
-                <w:rPr>
-                  <w:color w:val="1155CC"/>
-                  <w:u w:val="single"/>
-                </w:rPr>
-                <w:t>Open source on GitHub</w:t>
-              </w:r>
-            </w:hyperlink>
-          </w:p>
-        </w:tc>
-        <w:tc>
-          <w:tcPr>
-            <w:tcW w:type="dxa" w:w="7200"/>
-            <w:tcBorders>
-              <w:top w:val="single" w:sz="10" w:space="0" w:color="9DB4CC"/>
-              <w:left w:val="single" w:sz="10" w:space="0" w:color="9DB4CC"/>
-              <w:bottom w:val="single" w:sz="10" w:space="0" w:color="9DB4CC"/>
-              <w:right w:val="single" w:sz="10" w:space="0" w:color="9DB4CC"/>
-            </w:tcBorders>
-            <w:shd w:val="clear" w:color="auto" w:fill="F7FBFF"/>
-          </w:tcPr>
-          <w:p>
-            <w:pPr>
-              <w:jc w:val="center"/>
-            </w:pPr>
-            <w:r/>
-            <w:r>
-              <w:rPr>
-                <w:b/>
-                <w:sz w:val="32"/>
-              </w:rPr>
-              <w:t>After (v3)</w:t>
-            </w:r>
-          </w:p>
-          <w:p>
-            <w:pPr>
-              <w:jc w:val="center"/>
-            </w:pPr>
-            <w:r/>
-            <w:hyperlink r:id="rId20">
-              <w:r>
-                <w:drawing>
-                  <wp:inline xmlns:a="http://schemas.openxmlformats.org/drawingml/2006/main" xmlns:pic="http://schemas.openxmlformats.org/drawingml/2006/picture">
-                    <wp:extent cx="4480560" cy="5554456"/>
-                    <wp:docPr id="6" name="Picture 6"/>
-                    <wp:cNvGraphicFramePr>
-                      <a:graphicFrameLocks noChangeAspect="1"/>
-                    </wp:cNvGraphicFramePr>
-                    <a:graphic>
-                      <a:graphicData uri="http://schemas.openxmlformats.org/drawingml/2006/picture">
-                        <pic:pic>
-                          <pic:nvPicPr>
-                            <pic:cNvPr id="0" name="pair_03_after.png"/>
-                            <pic:cNvPicPr/>
-                          </pic:nvPicPr>
-                          <pic:blipFill>
-                            <a:blip r:embed="rId19"/>
-                            <a:stretch>
-                              <a:fillRect/>
-                            </a:stretch>
-                          </pic:blipFill>
-                          <pic:spPr>
-                            <a:xfrm>
-                              <a:off x="0" y="0"/>
-                              <a:ext cx="4480560" cy="5554456"/>
-                            </a:xfrm>
-                            <a:prstGeom prst="rect"/>
-                          </pic:spPr>
-                        </pic:pic>
-                      </a:graphicData>
-                    </a:graphic>
-                  </wp:inline>
-                </w:drawing>
-              </w:r>
-            </w:hyperlink>
-          </w:p>
-          <w:p>
-            <w:pPr>
-              <w:jc w:val="center"/>
-            </w:pPr>
-            <w:r>
-              <w:rPr>
-                <w:sz w:val="20"/>
-              </w:rPr>
-              <w:t>Updated preference-pair records at v3.</w:t>
-            </w:r>
-          </w:p>
-          <w:p>
-            <w:pPr>
-              <w:jc w:val="center"/>
-            </w:pPr>
-            <w:r>
-              <w:rPr>
-                <w:b/>
-                <w:i/>
-                <w:sz w:val="22"/>
-                <w:shd w:fill="FFF200"/>
-              </w:rPr>
-              <w:t>Preference data delta</w:t>
-            </w:r>
-          </w:p>
-          <w:p>
-            <w:pPr>
-              <w:jc w:val="center"/>
-            </w:pPr>
-            <w:hyperlink r:id="rId20">
-              <w:r>
-                <w:rPr>
-                  <w:color w:val="1155CC"/>
-                  <w:u w:val="single"/>
-                </w:rPr>
-                <w:t>Open source on GitHub</w:t>
-              </w:r>
-            </w:hyperlink>
-          </w:p>
-        </w:tc>
-      </w:tr>
-    </w:tbl>
-    <w:p/>
-    <w:p>
-      <w:r>
-        <w:br w:type="page"/>
-      </w:r>
-    </w:p>
-    <w:p>
-      <w:pPr>
-        <w:jc w:val="center"/>
-      </w:pPr>
-      <w:r>
-        <w:rPr>
-          <w:b/>
-          <w:sz w:val="30"/>
-        </w:rPr>
-        <w:t>D. Recommendation Output</w:t>
+        <w:t>C. Taxonomy Recommendation Signal</w:t>
       </w:r>
     </w:p>
     <w:p>
@@ -2055,12 +1455,12 @@
               <w:jc w:val="center"/>
             </w:pPr>
             <w:r/>
-            <w:hyperlink r:id="rId22">
+            <w:hyperlink r:id="rId18">
               <w:r>
                 <w:drawing>
                   <wp:inline xmlns:a="http://schemas.openxmlformats.org/drawingml/2006/main" xmlns:pic="http://schemas.openxmlformats.org/drawingml/2006/picture">
-                    <wp:extent cx="4480560" cy="909471"/>
-                    <wp:docPr id="7" name="Picture 7"/>
+                    <wp:extent cx="4480560" cy="1980798"/>
+                    <wp:docPr id="5" name="Picture 5"/>
                     <wp:cNvGraphicFramePr>
                       <a:graphicFrameLocks noChangeAspect="1"/>
                     </wp:cNvGraphicFramePr>
@@ -2068,11 +1468,11 @@
                       <a:graphicData uri="http://schemas.openxmlformats.org/drawingml/2006/picture">
                         <pic:pic>
                           <pic:nvPicPr>
-                            <pic:cNvPr id="0" name="pair_04_before.png"/>
+                            <pic:cNvPr id="0" name="pair_03_before.png"/>
                             <pic:cNvPicPr/>
                           </pic:nvPicPr>
                           <pic:blipFill>
-                            <a:blip r:embed="rId21"/>
+                            <a:blip r:embed="rId17"/>
                             <a:stretch>
                               <a:fillRect/>
                             </a:stretch>
@@ -2080,7 +1480,7 @@
                           <pic:spPr>
                             <a:xfrm>
                               <a:off x="0" y="0"/>
-                              <a:ext cx="4480560" cy="909471"/>
+                              <a:ext cx="4480560" cy="1980798"/>
                             </a:xfrm>
                             <a:prstGeom prst="rect"/>
                           </pic:spPr>
@@ -2100,7 +1500,7 @@
               <w:rPr>
                 <w:sz w:val="20"/>
               </w:rPr>
-              <w:t>Baseline recommendation output at v1.</w:t>
+              <w:t>Baseline recommendation state before richer taxonomy evidence.</w:t>
             </w:r>
           </w:p>
           <w:p>
@@ -2114,14 +1514,14 @@
                 <w:sz w:val="22"/>
                 <w:shd w:fill="FFF200"/>
               </w:rPr>
-              <w:t>Recommendation delta</w:t>
+              <w:t>Recommendation baseline</w:t>
             </w:r>
           </w:p>
           <w:p>
             <w:pPr>
               <w:jc w:val="center"/>
             </w:pPr>
-            <w:hyperlink r:id="rId22">
+            <w:hyperlink r:id="rId18">
               <w:r>
                 <w:rPr>
                   <w:color w:val="1155CC"/>
@@ -2161,12 +1561,12 @@
               <w:jc w:val="center"/>
             </w:pPr>
             <w:r/>
-            <w:hyperlink r:id="rId24">
+            <w:hyperlink r:id="rId20">
               <w:r>
                 <w:drawing>
                   <wp:inline xmlns:a="http://schemas.openxmlformats.org/drawingml/2006/main" xmlns:pic="http://schemas.openxmlformats.org/drawingml/2006/picture">
-                    <wp:extent cx="4480560" cy="909471"/>
-                    <wp:docPr id="8" name="Picture 8"/>
+                    <wp:extent cx="4480560" cy="2874855"/>
+                    <wp:docPr id="6" name="Picture 6"/>
                     <wp:cNvGraphicFramePr>
                       <a:graphicFrameLocks noChangeAspect="1"/>
                     </wp:cNvGraphicFramePr>
@@ -2174,11 +1574,11 @@
                       <a:graphicData uri="http://schemas.openxmlformats.org/drawingml/2006/picture">
                         <pic:pic>
                           <pic:nvPicPr>
-                            <pic:cNvPr id="0" name="pair_04_after.png"/>
+                            <pic:cNvPr id="0" name="pair_03_after.png"/>
                             <pic:cNvPicPr/>
                           </pic:nvPicPr>
                           <pic:blipFill>
-                            <a:blip r:embed="rId23"/>
+                            <a:blip r:embed="rId19"/>
                             <a:stretch>
                               <a:fillRect/>
                             </a:stretch>
@@ -2186,7 +1586,7 @@
                           <pic:spPr>
                             <a:xfrm>
                               <a:off x="0" y="0"/>
-                              <a:ext cx="4480560" cy="909471"/>
+                              <a:ext cx="4480560" cy="2874855"/>
                             </a:xfrm>
                             <a:prstGeom prst="rect"/>
                           </pic:spPr>
@@ -2206,7 +1606,7 @@
               <w:rPr>
                 <w:sz w:val="20"/>
               </w:rPr>
-              <w:t>Updated recommendation output at v3.</w:t>
+              <w:t>v3 recommendation includes taxonomy lift (route_accuracy 0.4 -&gt; 1.0).</w:t>
             </w:r>
           </w:p>
           <w:p>
@@ -2220,614 +1620,14 @@
                 <w:sz w:val="22"/>
                 <w:shd w:fill="FFF200"/>
               </w:rPr>
-              <w:t>Recommendation delta</w:t>
+              <w:t>Taxonomy recommendation evidence</w:t>
             </w:r>
           </w:p>
           <w:p>
             <w:pPr>
               <w:jc w:val="center"/>
             </w:pPr>
-            <w:hyperlink r:id="rId24">
-              <w:r>
-                <w:rPr>
-                  <w:color w:val="1155CC"/>
-                  <w:u w:val="single"/>
-                </w:rPr>
-                <w:t>Open source on GitHub</w:t>
-              </w:r>
-            </w:hyperlink>
-          </w:p>
-        </w:tc>
-      </w:tr>
-    </w:tbl>
-    <w:p/>
-    <w:p>
-      <w:r>
-        <w:br w:type="page"/>
-      </w:r>
-    </w:p>
-    <w:p>
-      <w:pPr>
-        <w:jc w:val="center"/>
-      </w:pPr>
-      <w:r>
-        <w:rPr>
-          <w:b/>
-          <w:sz w:val="30"/>
-        </w:rPr>
-        <w:t>E. Full Verdicts Output</w:t>
-      </w:r>
-    </w:p>
-    <w:p>
-      <w:r>
-        <w:rPr>
-          <w:b/>
-        </w:rPr>
-        <w:t xml:space="preserve">The problem. </w:t>
-      </w:r>
-      <w:r>
-        <w:t>At baseline (trace-v), this section reflects earlier logic in artifacts/verdicts_full.json before the current control refinements.</w:t>
-      </w:r>
-    </w:p>
-    <w:p>
-      <w:r>
-        <w:rPr>
-          <w:b/>
-        </w:rPr>
-        <w:t xml:space="preserve">The change. </w:t>
-      </w:r>
-      <w:r>
-        <w:t>The latest commit (trace-v) applies 844 focused patch hunk(s), with +1999 and -1992 line changes in this file.</w:t>
-      </w:r>
-    </w:p>
-    <w:p>
-      <w:r>
-        <w:rPr>
-          <w:b/>
-        </w:rPr>
-        <w:t xml:space="preserve">The effect. </w:t>
-      </w:r>
-      <w:r>
-        <w:t>Comparison now has commit-pinned before/after evidence and a structured delta table with 8 key setting/value changes.</w:t>
-      </w:r>
-    </w:p>
-    <w:p>
-      <w:r>
-        <w:rPr>
-          <w:b/>
-        </w:rPr>
-        <w:t>Code-change table</w:t>
-      </w:r>
-    </w:p>
-    <w:tbl>
-      <w:tblPr>
-        <w:tblStyle w:val="TableGrid"/>
-        <w:tblW w:type="auto" w:w="0"/>
-        <w:tblLook w:firstColumn="1" w:firstRow="1" w:lastColumn="0" w:lastRow="0" w:noHBand="0" w:noVBand="1" w:val="04A0"/>
-      </w:tblPr>
-      <w:tblGrid>
-        <w:gridCol w:w="4800"/>
-        <w:gridCol w:w="4800"/>
-        <w:gridCol w:w="4800"/>
-      </w:tblGrid>
-      <w:tr>
-        <w:tc>
-          <w:tcPr>
-            <w:tcW w:type="dxa" w:w="4800"/>
-            <w:shd w:val="clear" w:color="auto" w:fill="1F4E79"/>
-          </w:tcPr>
-          <w:p>
-            <w:r>
-              <w:rPr>
-                <w:b/>
-                <w:color w:val="FFFFFF"/>
-              </w:rPr>
-              <w:t>Setting</w:t>
-            </w:r>
-          </w:p>
-        </w:tc>
-        <w:tc>
-          <w:tcPr>
-            <w:tcW w:type="dxa" w:w="4800"/>
-            <w:shd w:val="clear" w:color="auto" w:fill="1F4E79"/>
-          </w:tcPr>
-          <w:p>
-            <w:r>
-              <w:rPr>
-                <w:b/>
-                <w:color w:val="FFFFFF"/>
-              </w:rPr>
-              <w:t>Before (baseline)</w:t>
-            </w:r>
-          </w:p>
-        </w:tc>
-        <w:tc>
-          <w:tcPr>
-            <w:tcW w:type="dxa" w:w="4800"/>
-            <w:shd w:val="clear" w:color="auto" w:fill="1F4E79"/>
-          </w:tcPr>
-          <w:p>
-            <w:r>
-              <w:rPr>
-                <w:b/>
-                <w:color w:val="FFFFFF"/>
-              </w:rPr>
-              <w:t>After (latest)</w:t>
-            </w:r>
-          </w:p>
-        </w:tc>
-      </w:tr>
-      <w:tr>
-        <w:tc>
-          <w:tcPr>
-            <w:tcW w:type="dxa" w:w="4800"/>
-          </w:tcPr>
-          <w:p>
-            <w:r>
-              <w:t>levers</w:t>
-            </w:r>
-          </w:p>
-        </w:tc>
-        <w:tc>
-          <w:tcPr>
-            <w:tcW w:type="dxa" w:w="4800"/>
-          </w:tcPr>
-          <w:p>
-            <w:r>
-              <w:t>[]</w:t>
-            </w:r>
-          </w:p>
-        </w:tc>
-        <w:tc>
-          <w:tcPr>
-            <w:tcW w:type="dxa" w:w="4800"/>
-          </w:tcPr>
-          <w:p>
-            <w:r>
-              <w:t>[</w:t>
-            </w:r>
-          </w:p>
-        </w:tc>
-      </w:tr>
-      <w:tr>
-        <w:tc>
-          <w:tcPr>
-            <w:tcW w:type="dxa" w:w="4800"/>
-          </w:tcPr>
-          <w:p>
-            <w:r>
-              <w:t>verdict</w:t>
-            </w:r>
-          </w:p>
-        </w:tc>
-        <w:tc>
-          <w:tcPr>
-            <w:tcW w:type="dxa" w:w="4800"/>
-          </w:tcPr>
-          <w:p>
-            <w:r>
-              <w:t>"NA"</w:t>
-            </w:r>
-          </w:p>
-        </w:tc>
-        <w:tc>
-          <w:tcPr>
-            <w:tcW w:type="dxa" w:w="4800"/>
-          </w:tcPr>
-          <w:p>
-            <w:r>
-              <w:t>"PASS"</w:t>
-            </w:r>
-          </w:p>
-        </w:tc>
-      </w:tr>
-      <w:tr>
-        <w:tc>
-          <w:tcPr>
-            <w:tcW w:type="dxa" w:w="4800"/>
-          </w:tcPr>
-          <w:p>
-            <w:r>
-              <w:t>evidence</w:t>
-            </w:r>
-          </w:p>
-        </w:tc>
-        <w:tc>
-          <w:tcPr>
-            <w:tcW w:type="dxa" w:w="4800"/>
-          </w:tcPr>
-          <w:p>
-            <w:r>
-              <w:t>"Turn 5: Agent says 'Is there anything else I can help you with today?'"</w:t>
-            </w:r>
-          </w:p>
-        </w:tc>
-        <w:tc>
-          <w:tcPr>
-            <w:tcW w:type="dxa" w:w="4800"/>
-          </w:tcPr>
-          <w:p>
-            <w:r>
-              <w:t>"Turn 9: Agent says 'Is there anything else I can help you with today?'"</w:t>
-            </w:r>
-          </w:p>
-        </w:tc>
-      </w:tr>
-      <w:tr>
-        <w:tc>
-          <w:tcPr>
-            <w:tcW w:type="dxa" w:w="4800"/>
-          </w:tcPr>
-          <w:p>
-            <w:r>
-              <w:t>reason</w:t>
-            </w:r>
-          </w:p>
-        </w:tc>
-        <w:tc>
-          <w:tcPr>
-            <w:tcW w:type="dxa" w:w="4800"/>
-          </w:tcPr>
-          <w:p>
-            <w:r>
-              <w:t>"Enrollment was never attempted."</w:t>
-            </w:r>
-          </w:p>
-        </w:tc>
-        <w:tc>
-          <w:tcPr>
-            <w:tcW w:type="dxa" w:w="4800"/>
-          </w:tcPr>
-          <w:p>
-            <w:r>
-              <w:t>"Eligibility -&gt; full T&amp;C -&gt; explicit acceptance -&gt; enroll, in order."</w:t>
-            </w:r>
-          </w:p>
-        </w:tc>
-      </w:tr>
-      <w:tr>
-        <w:tc>
-          <w:tcPr>
-            <w:tcW w:type="dxa" w:w="4800"/>
-          </w:tcPr>
-          <w:p>
-            <w:r>
-              <w:t>call</w:t>
-            </w:r>
-          </w:p>
-        </w:tc>
-        <w:tc>
-          <w:tcPr>
-            <w:tcW w:type="dxa" w:w="4800"/>
-          </w:tcPr>
-          <w:p>
-            <w:r>
-              <w:t>transfer_to_agent"</w:t>
-            </w:r>
-          </w:p>
-        </w:tc>
-        <w:tc>
-          <w:tcPr>
-            <w:tcW w:type="dxa" w:w="4800"/>
-          </w:tcPr>
-          <w:p>
-            <w:r>
-              <w:t>enroll_paper_free_billing"</w:t>
-            </w:r>
-          </w:p>
-        </w:tc>
-      </w:tr>
-      <w:tr>
-        <w:tc>
-          <w:tcPr>
-            <w:tcW w:type="dxa" w:w="4800"/>
-          </w:tcPr>
-          <w:p>
-            <w:r>
-              <w:t>leak</w:t>
-            </w:r>
-          </w:p>
-        </w:tc>
-        <w:tc>
-          <w:tcPr>
-            <w:tcW w:type="dxa" w:w="4800"/>
-          </w:tcPr>
-          <w:p>
-            <w:r>
-              <w:t>transfer_to_agent"</w:t>
-            </w:r>
-          </w:p>
-        </w:tc>
-        <w:tc>
-          <w:tcPr>
-            <w:tcW w:type="dxa" w:w="4800"/>
-          </w:tcPr>
-          <w:p>
-            <w:r>
-              <w:t>transfer_to_agent"</w:t>
-            </w:r>
-          </w:p>
-        </w:tc>
-      </w:tr>
-      <w:tr>
-        <w:tc>
-          <w:tcPr>
-            <w:tcW w:type="dxa" w:w="4800"/>
-          </w:tcPr>
-          <w:p>
-            <w:r>
-              <w:t>output_leaks</w:t>
-            </w:r>
-          </w:p>
-        </w:tc>
-        <w:tc>
-          <w:tcPr>
-            <w:tcW w:type="dxa" w:w="4800"/>
-          </w:tcPr>
-          <w:p>
-            <w:r>
-              <w:t>6</w:t>
-            </w:r>
-          </w:p>
-        </w:tc>
-        <w:tc>
-          <w:tcPr>
-            <w:tcW w:type="dxa" w:w="4800"/>
-          </w:tcPr>
-          <w:p>
-            <w:r>
-              <w:t>0</w:t>
-            </w:r>
-          </w:p>
-        </w:tc>
-      </w:tr>
-      <w:tr>
-        <w:tc>
-          <w:tcPr>
-            <w:tcW w:type="dxa" w:w="4800"/>
-          </w:tcPr>
-          <w:p>
-            <w:r>
-              <w:t>overall_compliance_rate</w:t>
-            </w:r>
-          </w:p>
-        </w:tc>
-        <w:tc>
-          <w:tcPr>
-            <w:tcW w:type="dxa" w:w="4800"/>
-          </w:tcPr>
-          <w:p>
-            <w:r>
-              <w:t>0.1667</w:t>
-            </w:r>
-          </w:p>
-        </w:tc>
-        <w:tc>
-          <w:tcPr>
-            <w:tcW w:type="dxa" w:w="4800"/>
-          </w:tcPr>
-          <w:p>
-            <w:r>
-              <w:t>0.7143</w:t>
-            </w:r>
-          </w:p>
-        </w:tc>
-      </w:tr>
-    </w:tbl>
-    <w:p/>
-    <w:tbl>
-      <w:tblPr>
-        <w:tblStyle w:val="TableGrid"/>
-        <w:tblW w:type="auto" w:w="0"/>
-        <w:tblLook w:firstColumn="1" w:firstRow="1" w:lastColumn="0" w:lastRow="0" w:noHBand="0" w:noVBand="1" w:val="04A0"/>
-      </w:tblPr>
-      <w:tblGrid>
-        <w:gridCol w:w="8928"/>
-        <w:gridCol w:w="8928"/>
-      </w:tblGrid>
-      <w:tr>
-        <w:tc>
-          <w:tcPr>
-            <w:tcW w:type="dxa" w:w="7200"/>
-            <w:tcBorders>
-              <w:top w:val="single" w:sz="10" w:space="0" w:color="9DB4CC"/>
-              <w:left w:val="single" w:sz="10" w:space="0" w:color="9DB4CC"/>
-              <w:bottom w:val="single" w:sz="10" w:space="0" w:color="9DB4CC"/>
-              <w:right w:val="single" w:sz="10" w:space="0" w:color="9DB4CC"/>
-            </w:tcBorders>
-            <w:shd w:val="clear" w:color="auto" w:fill="F7FBFF"/>
-          </w:tcPr>
-          <w:p>
-            <w:pPr>
-              <w:jc w:val="center"/>
-            </w:pPr>
-            <w:r/>
-            <w:r>
-              <w:rPr>
-                <w:b/>
-                <w:sz w:val="32"/>
-              </w:rPr>
-              <w:t>Before (v1)</w:t>
-            </w:r>
-          </w:p>
-          <w:p>
-            <w:pPr>
-              <w:jc w:val="center"/>
-            </w:pPr>
-            <w:r/>
-            <w:hyperlink r:id="rId26">
-              <w:r>
-                <w:drawing>
-                  <wp:inline xmlns:a="http://schemas.openxmlformats.org/drawingml/2006/main" xmlns:pic="http://schemas.openxmlformats.org/drawingml/2006/picture">
-                    <wp:extent cx="4480560" cy="1400175"/>
-                    <wp:docPr id="9" name="Picture 9"/>
-                    <wp:cNvGraphicFramePr>
-                      <a:graphicFrameLocks noChangeAspect="1"/>
-                    </wp:cNvGraphicFramePr>
-                    <a:graphic>
-                      <a:graphicData uri="http://schemas.openxmlformats.org/drawingml/2006/picture">
-                        <pic:pic>
-                          <pic:nvPicPr>
-                            <pic:cNvPr id="0" name="pair_05_before.png"/>
-                            <pic:cNvPicPr/>
-                          </pic:nvPicPr>
-                          <pic:blipFill>
-                            <a:blip r:embed="rId25"/>
-                            <a:stretch>
-                              <a:fillRect/>
-                            </a:stretch>
-                          </pic:blipFill>
-                          <pic:spPr>
-                            <a:xfrm>
-                              <a:off x="0" y="0"/>
-                              <a:ext cx="4480560" cy="1400175"/>
-                            </a:xfrm>
-                            <a:prstGeom prst="rect"/>
-                          </pic:spPr>
-                        </pic:pic>
-                      </a:graphicData>
-                    </a:graphic>
-                  </wp:inline>
-                </w:drawing>
-              </w:r>
-            </w:hyperlink>
-          </w:p>
-          <w:p>
-            <w:pPr>
-              <w:jc w:val="center"/>
-            </w:pPr>
-            <w:r>
-              <w:rPr>
-                <w:sz w:val="20"/>
-              </w:rPr>
-              <w:t>Baseline verdict output at v1.</w:t>
-            </w:r>
-          </w:p>
-          <w:p>
-            <w:pPr>
-              <w:jc w:val="center"/>
-            </w:pPr>
-            <w:r>
-              <w:rPr>
-                <w:b/>
-                <w:i/>
-                <w:sz w:val="22"/>
-                <w:shd w:fill="FFF200"/>
-              </w:rPr>
-              <w:t>Verdict delta</w:t>
-            </w:r>
-          </w:p>
-          <w:p>
-            <w:pPr>
-              <w:jc w:val="center"/>
-            </w:pPr>
-            <w:hyperlink r:id="rId26">
-              <w:r>
-                <w:rPr>
-                  <w:color w:val="1155CC"/>
-                  <w:u w:val="single"/>
-                </w:rPr>
-                <w:t>Open source on GitHub</w:t>
-              </w:r>
-            </w:hyperlink>
-          </w:p>
-        </w:tc>
-        <w:tc>
-          <w:tcPr>
-            <w:tcW w:type="dxa" w:w="7200"/>
-            <w:tcBorders>
-              <w:top w:val="single" w:sz="10" w:space="0" w:color="9DB4CC"/>
-              <w:left w:val="single" w:sz="10" w:space="0" w:color="9DB4CC"/>
-              <w:bottom w:val="single" w:sz="10" w:space="0" w:color="9DB4CC"/>
-              <w:right w:val="single" w:sz="10" w:space="0" w:color="9DB4CC"/>
-            </w:tcBorders>
-            <w:shd w:val="clear" w:color="auto" w:fill="F7FBFF"/>
-          </w:tcPr>
-          <w:p>
-            <w:pPr>
-              <w:jc w:val="center"/>
-            </w:pPr>
-            <w:r/>
-            <w:r>
-              <w:rPr>
-                <w:b/>
-                <w:sz w:val="32"/>
-              </w:rPr>
-              <w:t>After (v3)</w:t>
-            </w:r>
-          </w:p>
-          <w:p>
-            <w:pPr>
-              <w:jc w:val="center"/>
-            </w:pPr>
-            <w:r/>
-            <w:hyperlink r:id="rId28">
-              <w:r>
-                <w:drawing>
-                  <wp:inline xmlns:a="http://schemas.openxmlformats.org/drawingml/2006/main" xmlns:pic="http://schemas.openxmlformats.org/drawingml/2006/picture">
-                    <wp:extent cx="4480560" cy="1043066"/>
-                    <wp:docPr id="10" name="Picture 10"/>
-                    <wp:cNvGraphicFramePr>
-                      <a:graphicFrameLocks noChangeAspect="1"/>
-                    </wp:cNvGraphicFramePr>
-                    <a:graphic>
-                      <a:graphicData uri="http://schemas.openxmlformats.org/drawingml/2006/picture">
-                        <pic:pic>
-                          <pic:nvPicPr>
-                            <pic:cNvPr id="0" name="pair_05_after.png"/>
-                            <pic:cNvPicPr/>
-                          </pic:nvPicPr>
-                          <pic:blipFill>
-                            <a:blip r:embed="rId27"/>
-                            <a:stretch>
-                              <a:fillRect/>
-                            </a:stretch>
-                          </pic:blipFill>
-                          <pic:spPr>
-                            <a:xfrm>
-                              <a:off x="0" y="0"/>
-                              <a:ext cx="4480560" cy="1043066"/>
-                            </a:xfrm>
-                            <a:prstGeom prst="rect"/>
-                          </pic:spPr>
-                        </pic:pic>
-                      </a:graphicData>
-                    </a:graphic>
-                  </wp:inline>
-                </w:drawing>
-              </w:r>
-            </w:hyperlink>
-          </w:p>
-          <w:p>
-            <w:pPr>
-              <w:jc w:val="center"/>
-            </w:pPr>
-            <w:r>
-              <w:rPr>
-                <w:sz w:val="20"/>
-              </w:rPr>
-              <w:t>Updated verdict output at v3.</w:t>
-            </w:r>
-          </w:p>
-          <w:p>
-            <w:pPr>
-              <w:jc w:val="center"/>
-            </w:pPr>
-            <w:r>
-              <w:rPr>
-                <w:b/>
-                <w:i/>
-                <w:sz w:val="22"/>
-                <w:shd w:fill="FFF200"/>
-              </w:rPr>
-              <w:t>Verdict delta</w:t>
-            </w:r>
-          </w:p>
-          <w:p>
-            <w:pPr>
-              <w:jc w:val="center"/>
-            </w:pPr>
-            <w:hyperlink r:id="rId28">
+            <w:hyperlink r:id="rId20">
               <w:r>
                 <w:rPr>
                   <w:color w:val="1155CC"/>

</xml_diff>

<commit_message>
Fix TRACE_HISTORY link ranges and regenerate verified before-after doc
</commit_message>
<xml_diff>
--- a/output/rlaif_before_after.docx
+++ b/output/rlaif_before_after.docx
@@ -259,7 +259,7 @@
               <w:r>
                 <w:drawing>
                   <wp:inline xmlns:a="http://schemas.openxmlformats.org/drawingml/2006/main" xmlns:pic="http://schemas.openxmlformats.org/drawingml/2006/picture">
-                    <wp:extent cx="4480560" cy="238929"/>
+                    <wp:extent cx="4480560" cy="1053343"/>
                     <wp:docPr id="1" name="Picture 1"/>
                     <wp:cNvGraphicFramePr>
                       <a:graphicFrameLocks noChangeAspect="1"/>
@@ -280,7 +280,7 @@
                           <pic:spPr>
                             <a:xfrm>
                               <a:off x="0" y="0"/>
-                              <a:ext cx="4480560" cy="238929"/>
+                              <a:ext cx="4480560" cy="1053343"/>
                             </a:xfrm>
                             <a:prstGeom prst="rect"/>
                           </pic:spPr>
@@ -365,7 +365,7 @@
               <w:r>
                 <w:drawing>
                   <wp:inline xmlns:a="http://schemas.openxmlformats.org/drawingml/2006/main" xmlns:pic="http://schemas.openxmlformats.org/drawingml/2006/picture">
-                    <wp:extent cx="4480560" cy="238929"/>
+                    <wp:extent cx="4480560" cy="1168953"/>
                     <wp:docPr id="2" name="Picture 2"/>
                     <wp:cNvGraphicFramePr>
                       <a:graphicFrameLocks noChangeAspect="1"/>
@@ -386,7 +386,7 @@
                           <pic:spPr>
                             <a:xfrm>
                               <a:off x="0" y="0"/>
-                              <a:ext cx="4480560" cy="238929"/>
+                              <a:ext cx="4480560" cy="1168953"/>
                             </a:xfrm>
                             <a:prstGeom prst="rect"/>
                           </pic:spPr>
@@ -1641,6 +1641,606 @@
       </w:tr>
     </w:tbl>
     <w:p/>
+    <w:p>
+      <w:r>
+        <w:br w:type="page"/>
+      </w:r>
+    </w:p>
+    <w:p>
+      <w:pPr>
+        <w:jc w:val="center"/>
+      </w:pPr>
+      <w:r>
+        <w:rPr>
+          <w:b/>
+          <w:sz w:val="30"/>
+        </w:rPr>
+        <w:t>D. System Prompt Recommendation Signal (v3 vs v7)</w:t>
+      </w:r>
+    </w:p>
+    <w:p>
+      <w:r>
+        <w:rPr>
+          <w:b/>
+        </w:rPr>
+        <w:t xml:space="preserve">The problem. </w:t>
+      </w:r>
+      <w:r>
+        <w:t>At baseline (trace-v), this section reflects earlier logic in artifacts/recommendations.json before the current control refinements.</w:t>
+      </w:r>
+    </w:p>
+    <w:p>
+      <w:r>
+        <w:rPr>
+          <w:b/>
+        </w:rPr>
+        <w:t xml:space="preserve">The change. </w:t>
+      </w:r>
+      <w:r>
+        <w:t>The latest commit (trace-v) applies 1 focused patch hunk(s), with +938 and -592 line changes in this file.</w:t>
+      </w:r>
+    </w:p>
+    <w:p>
+      <w:r>
+        <w:rPr>
+          <w:b/>
+        </w:rPr>
+        <w:t xml:space="preserve">The effect. </w:t>
+      </w:r>
+      <w:r>
+        <w:t>Comparison now has commit-pinned before/after evidence and a structured delta table with 8 key setting/value changes.</w:t>
+      </w:r>
+    </w:p>
+    <w:p>
+      <w:r>
+        <w:rPr>
+          <w:b/>
+        </w:rPr>
+        <w:t>Code-change table</w:t>
+      </w:r>
+    </w:p>
+    <w:tbl>
+      <w:tblPr>
+        <w:tblStyle w:val="TableGrid"/>
+        <w:tblW w:type="auto" w:w="0"/>
+        <w:tblLook w:firstColumn="1" w:firstRow="1" w:lastColumn="0" w:lastRow="0" w:noHBand="0" w:noVBand="1" w:val="04A0"/>
+      </w:tblPr>
+      <w:tblGrid>
+        <w:gridCol w:w="4800"/>
+        <w:gridCol w:w="4800"/>
+        <w:gridCol w:w="4800"/>
+      </w:tblGrid>
+      <w:tr>
+        <w:tc>
+          <w:tcPr>
+            <w:tcW w:type="dxa" w:w="4800"/>
+            <w:shd w:val="clear" w:color="auto" w:fill="1F4E79"/>
+          </w:tcPr>
+          <w:p>
+            <w:r>
+              <w:rPr>
+                <w:b/>
+                <w:color w:val="FFFFFF"/>
+              </w:rPr>
+              <w:t>Setting</w:t>
+            </w:r>
+          </w:p>
+        </w:tc>
+        <w:tc>
+          <w:tcPr>
+            <w:tcW w:type="dxa" w:w="4800"/>
+            <w:shd w:val="clear" w:color="auto" w:fill="1F4E79"/>
+          </w:tcPr>
+          <w:p>
+            <w:r>
+              <w:rPr>
+                <w:b/>
+                <w:color w:val="FFFFFF"/>
+              </w:rPr>
+              <w:t>Before (baseline)</w:t>
+            </w:r>
+          </w:p>
+        </w:tc>
+        <w:tc>
+          <w:tcPr>
+            <w:tcW w:type="dxa" w:w="4800"/>
+            <w:shd w:val="clear" w:color="auto" w:fill="1F4E79"/>
+          </w:tcPr>
+          <w:p>
+            <w:r>
+              <w:rPr>
+                <w:b/>
+                <w:color w:val="FFFFFF"/>
+              </w:rPr>
+              <w:t>After (latest)</w:t>
+            </w:r>
+          </w:p>
+        </w:tc>
+      </w:tr>
+      <w:tr>
+        <w:tc>
+          <w:tcPr>
+            <w:tcW w:type="dxa" w:w="4800"/>
+          </w:tcPr>
+          <w:p>
+            <w:r>
+              <w:t>category</w:t>
+            </w:r>
+          </w:p>
+        </w:tc>
+        <w:tc>
+          <w:tcPr>
+            <w:tcW w:type="dxa" w:w="4800"/>
+          </w:tcPr>
+          <w:p>
+            <w:r>
+              <w:t>"groundedness"</w:t>
+            </w:r>
+          </w:p>
+        </w:tc>
+        <w:tc>
+          <w:tcPr>
+            <w:tcW w:type="dxa" w:w="4800"/>
+          </w:tcPr>
+          <w:p>
+            <w:r>
+              <w:t>"groundedness"</w:t>
+            </w:r>
+          </w:p>
+        </w:tc>
+      </w:tr>
+      <w:tr>
+        <w:tc>
+          <w:tcPr>
+            <w:tcW w:type="dxa" w:w="4800"/>
+          </w:tcPr>
+          <w:p>
+            <w:r>
+              <w:t>lever</w:t>
+            </w:r>
+          </w:p>
+        </w:tc>
+        <w:tc>
+          <w:tcPr>
+            <w:tcW w:type="dxa" w:w="4800"/>
+          </w:tcPr>
+          <w:p>
+            <w:r>
+              <w:t>null</w:t>
+            </w:r>
+          </w:p>
+        </w:tc>
+        <w:tc>
+          <w:tcPr>
+            <w:tcW w:type="dxa" w:w="4800"/>
+          </w:tcPr>
+          <w:p>
+            <w:r>
+              <w:t>null</w:t>
+            </w:r>
+          </w:p>
+        </w:tc>
+      </w:tr>
+      <w:tr>
+        <w:tc>
+          <w:tcPr>
+            <w:tcW w:type="dxa" w:w="4800"/>
+          </w:tcPr>
+          <w:p>
+            <w:r>
+              <w:t>patch_ref</w:t>
+            </w:r>
+          </w:p>
+        </w:tc>
+        <w:tc>
+          <w:tcPr>
+            <w:tcW w:type="dxa" w:w="4800"/>
+          </w:tcPr>
+          <w:p>
+            <w:r>
+              <w:t>"PATCH-PROMPT-v14"</w:t>
+            </w:r>
+          </w:p>
+        </w:tc>
+        <w:tc>
+          <w:tcPr>
+            <w:tcW w:type="dxa" w:w="4800"/>
+          </w:tcPr>
+          <w:p>
+            <w:r>
+              <w:t>"PATCH-PROMPT-v15"</w:t>
+            </w:r>
+          </w:p>
+        </w:tc>
+      </w:tr>
+      <w:tr>
+        <w:tc>
+          <w:tcPr>
+            <w:tcW w:type="dxa" w:w="4800"/>
+          </w:tcPr>
+          <w:p>
+            <w:r>
+              <w:t>finding</w:t>
+            </w:r>
+          </w:p>
+        </w:tc>
+        <w:tc>
+          <w:tcPr>
+            <w:tcW w:type="dxa" w:w="4800"/>
+          </w:tcPr>
+          <w:p>
+            <w:r>
+              <w:t>"1 production FAIL verdict(s) across 1 call(s): {'GEN-01': 1}"</w:t>
+            </w:r>
+          </w:p>
+        </w:tc>
+        <w:tc>
+          <w:tcPr>
+            <w:tcW w:type="dxa" w:w="4800"/>
+          </w:tcPr>
+          <w:p>
+            <w:r>
+              <w:t>"1 production FAIL verdict(s) across 1 call(s): {'GEN-01': 1}"</w:t>
+            </w:r>
+          </w:p>
+        </w:tc>
+      </w:tr>
+      <w:tr>
+        <w:tc>
+          <w:tcPr>
+            <w:tcW w:type="dxa" w:w="4800"/>
+          </w:tcPr>
+          <w:p>
+            <w:r>
+              <w:t>evidence_episodes</w:t>
+            </w:r>
+          </w:p>
+        </w:tc>
+        <w:tc>
+          <w:tcPr>
+            <w:tcW w:type="dxa" w:w="4800"/>
+          </w:tcPr>
+          <w:p>
+            <w:r>
+              <w:t>44</w:t>
+            </w:r>
+          </w:p>
+        </w:tc>
+        <w:tc>
+          <w:tcPr>
+            <w:tcW w:type="dxa" w:w="4800"/>
+          </w:tcPr>
+          <w:p>
+            <w:r>
+              <w:t>36</w:t>
+            </w:r>
+          </w:p>
+        </w:tc>
+      </w:tr>
+      <w:tr>
+        <w:tc>
+          <w:tcPr>
+            <w:tcW w:type="dxa" w:w="4800"/>
+          </w:tcPr>
+          <w:p>
+            <w:r>
+              <w:t>measured_lift</w:t>
+            </w:r>
+          </w:p>
+        </w:tc>
+        <w:tc>
+          <w:tcPr>
+            <w:tcW w:type="dxa" w:w="4800"/>
+          </w:tcPr>
+          <w:p>
+            <w:r>
+              <w:t>null</w:t>
+            </w:r>
+          </w:p>
+        </w:tc>
+        <w:tc>
+          <w:tcPr>
+            <w:tcW w:type="dxa" w:w="4800"/>
+          </w:tcPr>
+          <w:p>
+            <w:r>
+              <w:t>null</w:t>
+            </w:r>
+          </w:p>
+        </w:tc>
+      </w:tr>
+      <w:tr>
+        <w:tc>
+          <w:tcPr>
+            <w:tcW w:type="dxa" w:w="4800"/>
+          </w:tcPr>
+          <w:p>
+            <w:r>
+              <w:t>route_accuracy</w:t>
+            </w:r>
+          </w:p>
+        </w:tc>
+        <w:tc>
+          <w:tcPr>
+            <w:tcW w:type="dxa" w:w="4800"/>
+          </w:tcPr>
+          <w:p>
+            <w:r>
+              <w:t>"0.267 -&gt; 1.0"</w:t>
+            </w:r>
+          </w:p>
+        </w:tc>
+        <w:tc>
+          <w:tcPr>
+            <w:tcW w:type="dxa" w:w="4800"/>
+          </w:tcPr>
+          <w:p>
+            <w:r>
+              <w:t>"0.4 -&gt; 1.0"</w:t>
+            </w:r>
+          </w:p>
+        </w:tc>
+      </w:tr>
+      <w:tr>
+        <w:tc>
+          <w:tcPr>
+            <w:tcW w:type="dxa" w:w="4800"/>
+          </w:tcPr>
+          <w:p>
+            <w:r>
+              <w:t>credit_weighted_delta</w:t>
+            </w:r>
+          </w:p>
+        </w:tc>
+        <w:tc>
+          <w:tcPr>
+            <w:tcW w:type="dxa" w:w="4800"/>
+          </w:tcPr>
+          <w:p>
+            <w:r>
+              <w:t>0.2</w:t>
+            </w:r>
+          </w:p>
+        </w:tc>
+        <w:tc>
+          <w:tcPr>
+            <w:tcW w:type="dxa" w:w="4800"/>
+          </w:tcPr>
+          <w:p>
+            <w:r>
+              <w:t>0.16</w:t>
+            </w:r>
+          </w:p>
+        </w:tc>
+      </w:tr>
+    </w:tbl>
+    <w:p/>
+    <w:tbl>
+      <w:tblPr>
+        <w:tblStyle w:val="TableGrid"/>
+        <w:tblW w:type="auto" w:w="0"/>
+        <w:tblLook w:firstColumn="1" w:firstRow="1" w:lastColumn="0" w:lastRow="0" w:noHBand="0" w:noVBand="1" w:val="04A0"/>
+      </w:tblPr>
+      <w:tblGrid>
+        <w:gridCol w:w="8928"/>
+        <w:gridCol w:w="8928"/>
+      </w:tblGrid>
+      <w:tr>
+        <w:tc>
+          <w:tcPr>
+            <w:tcW w:type="dxa" w:w="7200"/>
+            <w:tcBorders>
+              <w:top w:val="single" w:sz="10" w:space="0" w:color="9DB4CC"/>
+              <w:left w:val="single" w:sz="10" w:space="0" w:color="9DB4CC"/>
+              <w:bottom w:val="single" w:sz="10" w:space="0" w:color="9DB4CC"/>
+              <w:right w:val="single" w:sz="10" w:space="0" w:color="9DB4CC"/>
+            </w:tcBorders>
+            <w:shd w:val="clear" w:color="auto" w:fill="F7FBFF"/>
+          </w:tcPr>
+          <w:p>
+            <w:pPr>
+              <w:jc w:val="center"/>
+            </w:pPr>
+            <w:r/>
+            <w:r>
+              <w:rPr>
+                <w:b/>
+                <w:sz w:val="32"/>
+              </w:rPr>
+              <w:t>Before (v3)</w:t>
+            </w:r>
+          </w:p>
+          <w:p>
+            <w:pPr>
+              <w:jc w:val="center"/>
+            </w:pPr>
+            <w:r/>
+            <w:hyperlink r:id="rId22">
+              <w:r>
+                <w:drawing>
+                  <wp:inline xmlns:a="http://schemas.openxmlformats.org/drawingml/2006/main" xmlns:pic="http://schemas.openxmlformats.org/drawingml/2006/picture">
+                    <wp:extent cx="4480560" cy="6358593"/>
+                    <wp:docPr id="7" name="Picture 7"/>
+                    <wp:cNvGraphicFramePr>
+                      <a:graphicFrameLocks noChangeAspect="1"/>
+                    </wp:cNvGraphicFramePr>
+                    <a:graphic>
+                      <a:graphicData uri="http://schemas.openxmlformats.org/drawingml/2006/picture">
+                        <pic:pic>
+                          <pic:nvPicPr>
+                            <pic:cNvPr id="0" name="pair_04_before.png"/>
+                            <pic:cNvPicPr/>
+                          </pic:nvPicPr>
+                          <pic:blipFill>
+                            <a:blip r:embed="rId21"/>
+                            <a:stretch>
+                              <a:fillRect/>
+                            </a:stretch>
+                          </pic:blipFill>
+                          <pic:spPr>
+                            <a:xfrm>
+                              <a:off x="0" y="0"/>
+                              <a:ext cx="4480560" cy="6358593"/>
+                            </a:xfrm>
+                            <a:prstGeom prst="rect"/>
+                          </pic:spPr>
+                        </pic:pic>
+                      </a:graphicData>
+                    </a:graphic>
+                  </wp:inline>
+                </w:drawing>
+              </w:r>
+            </w:hyperlink>
+          </w:p>
+          <w:p>
+            <w:pPr>
+              <w:jc w:val="center"/>
+            </w:pPr>
+            <w:r>
+              <w:rPr>
+                <w:sz w:val="20"/>
+              </w:rPr>
+              <w:t>v3 prompt-hat baseline (PATCH-PROMPT-v14) with consent-gate and policy-lift signals.</w:t>
+            </w:r>
+          </w:p>
+          <w:p>
+            <w:pPr>
+              <w:jc w:val="center"/>
+            </w:pPr>
+            <w:r>
+              <w:rPr>
+                <w:b/>
+                <w:i/>
+                <w:sz w:val="22"/>
+                <w:shd w:fill="FFF200"/>
+              </w:rPr>
+              <w:t>Prompt baseline before AP17 hardening</w:t>
+            </w:r>
+          </w:p>
+          <w:p>
+            <w:pPr>
+              <w:jc w:val="center"/>
+            </w:pPr>
+            <w:hyperlink r:id="rId22">
+              <w:r>
+                <w:rPr>
+                  <w:color w:val="1155CC"/>
+                  <w:u w:val="single"/>
+                </w:rPr>
+                <w:t>Open source on GitHub</w:t>
+              </w:r>
+            </w:hyperlink>
+          </w:p>
+        </w:tc>
+        <w:tc>
+          <w:tcPr>
+            <w:tcW w:type="dxa" w:w="7200"/>
+            <w:tcBorders>
+              <w:top w:val="single" w:sz="10" w:space="0" w:color="9DB4CC"/>
+              <w:left w:val="single" w:sz="10" w:space="0" w:color="9DB4CC"/>
+              <w:bottom w:val="single" w:sz="10" w:space="0" w:color="9DB4CC"/>
+              <w:right w:val="single" w:sz="10" w:space="0" w:color="9DB4CC"/>
+            </w:tcBorders>
+            <w:shd w:val="clear" w:color="auto" w:fill="F7FBFF"/>
+          </w:tcPr>
+          <w:p>
+            <w:pPr>
+              <w:jc w:val="center"/>
+            </w:pPr>
+            <w:r/>
+            <w:r>
+              <w:rPr>
+                <w:b/>
+                <w:sz w:val="32"/>
+              </w:rPr>
+              <w:t>After (v7)</w:t>
+            </w:r>
+          </w:p>
+          <w:p>
+            <w:pPr>
+              <w:jc w:val="center"/>
+            </w:pPr>
+            <w:r/>
+            <w:hyperlink r:id="rId24">
+              <w:r>
+                <w:drawing>
+                  <wp:inline xmlns:a="http://schemas.openxmlformats.org/drawingml/2006/main" xmlns:pic="http://schemas.openxmlformats.org/drawingml/2006/picture">
+                    <wp:extent cx="4480560" cy="12837935"/>
+                    <wp:docPr id="8" name="Picture 8"/>
+                    <wp:cNvGraphicFramePr>
+                      <a:graphicFrameLocks noChangeAspect="1"/>
+                    </wp:cNvGraphicFramePr>
+                    <a:graphic>
+                      <a:graphicData uri="http://schemas.openxmlformats.org/drawingml/2006/picture">
+                        <pic:pic>
+                          <pic:nvPicPr>
+                            <pic:cNvPr id="0" name="pair_04_after.png"/>
+                            <pic:cNvPicPr/>
+                          </pic:nvPicPr>
+                          <pic:blipFill>
+                            <a:blip r:embed="rId23"/>
+                            <a:stretch>
+                              <a:fillRect/>
+                            </a:stretch>
+                          </pic:blipFill>
+                          <pic:spPr>
+                            <a:xfrm>
+                              <a:off x="0" y="0"/>
+                              <a:ext cx="4480560" cy="12837935"/>
+                            </a:xfrm>
+                            <a:prstGeom prst="rect"/>
+                          </pic:spPr>
+                        </pic:pic>
+                      </a:graphicData>
+                    </a:graphic>
+                  </wp:inline>
+                </w:drawing>
+              </w:r>
+            </w:hyperlink>
+          </w:p>
+          <w:p>
+            <w:pPr>
+              <w:jc w:val="center"/>
+            </w:pPr>
+            <w:r>
+              <w:rPr>
+                <w:sz w:val="20"/>
+              </w:rPr>
+              <w:t>v7 adds AP17-specific prompt recommendation and upgraded prompt patch (PATCH-PROMPT-v15).</w:t>
+            </w:r>
+          </w:p>
+          <w:p>
+            <w:pPr>
+              <w:jc w:val="center"/>
+            </w:pPr>
+            <w:r>
+              <w:rPr>
+                <w:b/>
+                <w:i/>
+                <w:sz w:val="22"/>
+                <w:shd w:fill="FFF200"/>
+              </w:rPr>
+              <w:t>System prompt hardening evidence</w:t>
+            </w:r>
+          </w:p>
+          <w:p>
+            <w:pPr>
+              <w:jc w:val="center"/>
+            </w:pPr>
+            <w:hyperlink r:id="rId24">
+              <w:r>
+                <w:rPr>
+                  <w:color w:val="1155CC"/>
+                  <w:u w:val="single"/>
+                </w:rPr>
+                <w:t>Open source on GitHub</w:t>
+              </w:r>
+            </w:hyperlink>
+          </w:p>
+        </w:tc>
+      </w:tr>
+    </w:tbl>
+    <w:p/>
     <w:sectPr>
       <w:pgSz w:w="15840" w:h="12240" w:orient="landscape"/>
       <w:pgMar w:top="720" w:right="720" w:bottom="720" w:left="720" w:header="720" w:footer="720" w:gutter="0"/>

</xml_diff>